<commit_message>
Se actualiza tabla de contenidos (índice)
</commit_message>
<xml_diff>
--- a/manual-aplicativo-validador-consistencias-rem-ver-3.0.docx
+++ b/manual-aplicativo-validador-consistencias-rem-ver-3.0.docx
@@ -1479,7 +1479,7 @@
               <w:sz w:val="22"/>
               <w:szCs w:val="22"/>
             </w:rPr>
-            <w:id w:val="-60957420"/>
+            <w:id w:val="-970433622"/>
             <w:docPartObj>
               <w:docPartGallery w:val="Table of Contents"/>
               <w:docPartUnique/>
@@ -1525,13 +1525,11 @@
               <w:r>
                 <w:fldChar w:fldCharType="separate"/>
               </w:r>
-              <w:hyperlink w:anchor="_Toc234333574" w:history="1">
+              <w:hyperlink w:anchor="_Toc234404038" w:history="1">
                 <w:r>
                   <w:rPr>
                     <w:rStyle w:val="Hipervnculo"/>
-                    <w:rFonts w:ascii="Segoe UI Light" w:hAnsi="Segoe UI Light" w:cs="Segoe UI Light"/>
-                    <w:b/>
-                    <w:bCs/>
+                    <w:rFonts w:cs="Segoe UI Light"/>
                     <w:noProof/>
                   </w:rPr>
                   <w:t>INTRODUCCIÓN</w:t>
@@ -1555,7 +1553,7 @@
                     <w:noProof/>
                     <w:webHidden/>
                   </w:rPr>
-                  <w:instrText xml:space="preserve"> PAGEREF _Toc234333574 \h </w:instrText>
+                  <w:instrText xml:space="preserve"> PAGEREF _Toc234404038 \h </w:instrText>
                 </w:r>
                 <w:r>
                   <w:rPr>
@@ -1602,13 +1600,11 @@
                   <w14:ligatures w14:val="standardContextual"/>
                 </w:rPr>
               </w:pPr>
-              <w:hyperlink w:anchor="_Toc234333575" w:history="1">
+              <w:hyperlink w:anchor="_Toc234404039" w:history="1">
                 <w:r>
                   <w:rPr>
                     <w:rStyle w:val="Hipervnculo"/>
-                    <w:rFonts w:ascii="Segoe UI Light" w:hAnsi="Segoe UI Light" w:cs="Segoe UI Light"/>
-                    <w:b/>
-                    <w:bCs/>
+                    <w:rFonts w:cs="Segoe UI Light"/>
                     <w:noProof/>
                   </w:rPr>
                   <w:t>ALCANCE</w:t>
@@ -1632,7 +1628,7 @@
                     <w:noProof/>
                     <w:webHidden/>
                   </w:rPr>
-                  <w:instrText xml:space="preserve"> PAGEREF _Toc234333575 \h </w:instrText>
+                  <w:instrText xml:space="preserve"> PAGEREF _Toc234404039 \h </w:instrText>
                 </w:r>
                 <w:r>
                   <w:rPr>
@@ -1679,13 +1675,10 @@
                   <w14:ligatures w14:val="standardContextual"/>
                 </w:rPr>
               </w:pPr>
-              <w:hyperlink w:anchor="_Toc234333576" w:history="1">
+              <w:hyperlink w:anchor="_Toc234404040" w:history="1">
                 <w:r>
                   <w:rPr>
                     <w:rStyle w:val="Hipervnculo"/>
-                    <w:rFonts w:ascii="Segoe UI Light" w:hAnsi="Segoe UI Light" w:cs="Segoe UI Light"/>
-                    <w:b/>
-                    <w:bCs/>
                     <w:noProof/>
                   </w:rPr>
                   <w:t>DESCRIPCIÓN DEL APLICATIVO DE VALIDACIÓN REM</w:t>
@@ -1709,7 +1702,7 @@
                     <w:noProof/>
                     <w:webHidden/>
                   </w:rPr>
-                  <w:instrText xml:space="preserve"> PAGEREF _Toc234333576 \h </w:instrText>
+                  <w:instrText xml:space="preserve"> PAGEREF _Toc234404040 \h </w:instrText>
                 </w:r>
                 <w:r>
                   <w:rPr>
@@ -1756,16 +1749,13 @@
                   <w14:ligatures w14:val="standardContextual"/>
                 </w:rPr>
               </w:pPr>
-              <w:hyperlink w:anchor="_Toc234333577" w:history="1">
+              <w:hyperlink w:anchor="_Toc234404041" w:history="1">
                 <w:r>
                   <w:rPr>
                     <w:rStyle w:val="Hipervnculo"/>
-                    <w:rFonts w:ascii="Segoe UI Light" w:hAnsi="Segoe UI Light" w:cs="Segoe UI Light"/>
-                    <w:b/>
-                    <w:bCs/>
                     <w:noProof/>
                   </w:rPr>
-                  <w:t>EJECUCIÓN DEL APLICATIVO DE VALIDACIÓN REM: Inicio del Proceso</w:t>
+                  <w:t>1.OBJETIVOS:</w:t>
                 </w:r>
                 <w:r>
                   <w:rPr>
@@ -1786,7 +1776,7 @@
                     <w:noProof/>
                     <w:webHidden/>
                   </w:rPr>
-                  <w:instrText xml:space="preserve"> PAGEREF _Toc234333577 \h </w:instrText>
+                  <w:instrText xml:space="preserve"> PAGEREF _Toc234404041 \h </w:instrText>
                 </w:r>
                 <w:r>
                   <w:rPr>
@@ -1806,7 +1796,7 @@
                     <w:noProof/>
                     <w:webHidden/>
                   </w:rPr>
-                  <w:t>5</w:t>
+                  <w:t>2</w:t>
                 </w:r>
                 <w:r>
                   <w:rPr>
@@ -1833,13 +1823,233 @@
                   <w14:ligatures w14:val="standardContextual"/>
                 </w:rPr>
               </w:pPr>
-              <w:hyperlink w:anchor="_Toc234333578" w:history="1">
+              <w:hyperlink w:anchor="_Toc234404042" w:history="1">
                 <w:r>
                   <w:rPr>
                     <w:rStyle w:val="Hipervnculo"/>
-                    <w:rFonts w:ascii="Segoe UI Light" w:hAnsi="Segoe UI Light" w:cs="Segoe UI Light"/>
-                    <w:b/>
-                    <w:bCs/>
+                    <w:noProof/>
+                  </w:rPr>
+                  <w:t>2.FUNCIONALIDADES:</w:t>
+                </w:r>
+                <w:r>
+                  <w:rPr>
+                    <w:noProof/>
+                    <w:webHidden/>
+                  </w:rPr>
+                  <w:tab/>
+                </w:r>
+                <w:r>
+                  <w:rPr>
+                    <w:noProof/>
+                    <w:webHidden/>
+                  </w:rPr>
+                  <w:fldChar w:fldCharType="begin"/>
+                </w:r>
+                <w:r>
+                  <w:rPr>
+                    <w:noProof/>
+                    <w:webHidden/>
+                  </w:rPr>
+                  <w:instrText xml:space="preserve"> PAGEREF _Toc234404042 \h </w:instrText>
+                </w:r>
+                <w:r>
+                  <w:rPr>
+                    <w:noProof/>
+                    <w:webHidden/>
+                  </w:rPr>
+                </w:r>
+                <w:r>
+                  <w:rPr>
+                    <w:noProof/>
+                    <w:webHidden/>
+                  </w:rPr>
+                  <w:fldChar w:fldCharType="separate"/>
+                </w:r>
+                <w:r>
+                  <w:rPr>
+                    <w:noProof/>
+                    <w:webHidden/>
+                  </w:rPr>
+                  <w:t>2</w:t>
+                </w:r>
+                <w:r>
+                  <w:rPr>
+                    <w:noProof/>
+                    <w:webHidden/>
+                  </w:rPr>
+                  <w:fldChar w:fldCharType="end"/>
+                </w:r>
+              </w:hyperlink>
+            </w:p>
+            <w:p>
+              <w:pPr>
+                <w:pStyle w:val="TDC1"/>
+                <w:tabs>
+                  <w:tab w:val="right" w:leader="dot" w:pos="8828"/>
+                </w:tabs>
+                <w:rPr>
+                  <w:rFonts w:asciiTheme="minorHAnsi" w:eastAsiaTheme="minorEastAsia" w:hAnsiTheme="minorHAnsi" w:cstheme="minorBidi"/>
+                  <w:noProof/>
+                  <w:kern w:val="2"/>
+                  <w:sz w:val="24"/>
+                  <w:szCs w:val="24"/>
+                  <w:lang w:val="es-CL" w:eastAsia="es-CL" w:bidi="ar-SA"/>
+                  <w14:ligatures w14:val="standardContextual"/>
+                </w:rPr>
+              </w:pPr>
+              <w:hyperlink w:anchor="_Toc234404043" w:history="1">
+                <w:r>
+                  <w:rPr>
+                    <w:rStyle w:val="Hipervnculo"/>
+                    <w:noProof/>
+                  </w:rPr>
+                  <w:t>3.REQUISITOS:</w:t>
+                </w:r>
+                <w:r>
+                  <w:rPr>
+                    <w:noProof/>
+                    <w:webHidden/>
+                  </w:rPr>
+                  <w:tab/>
+                </w:r>
+                <w:r>
+                  <w:rPr>
+                    <w:noProof/>
+                    <w:webHidden/>
+                  </w:rPr>
+                  <w:fldChar w:fldCharType="begin"/>
+                </w:r>
+                <w:r>
+                  <w:rPr>
+                    <w:noProof/>
+                    <w:webHidden/>
+                  </w:rPr>
+                  <w:instrText xml:space="preserve"> PAGEREF _Toc234404043 \h </w:instrText>
+                </w:r>
+                <w:r>
+                  <w:rPr>
+                    <w:noProof/>
+                    <w:webHidden/>
+                  </w:rPr>
+                </w:r>
+                <w:r>
+                  <w:rPr>
+                    <w:noProof/>
+                    <w:webHidden/>
+                  </w:rPr>
+                  <w:fldChar w:fldCharType="separate"/>
+                </w:r>
+                <w:r>
+                  <w:rPr>
+                    <w:noProof/>
+                    <w:webHidden/>
+                  </w:rPr>
+                  <w:t>3</w:t>
+                </w:r>
+                <w:r>
+                  <w:rPr>
+                    <w:noProof/>
+                    <w:webHidden/>
+                  </w:rPr>
+                  <w:fldChar w:fldCharType="end"/>
+                </w:r>
+              </w:hyperlink>
+            </w:p>
+            <w:p>
+              <w:pPr>
+                <w:pStyle w:val="TDC1"/>
+                <w:tabs>
+                  <w:tab w:val="right" w:leader="dot" w:pos="8828"/>
+                </w:tabs>
+                <w:rPr>
+                  <w:rFonts w:asciiTheme="minorHAnsi" w:eastAsiaTheme="minorEastAsia" w:hAnsiTheme="minorHAnsi" w:cstheme="minorBidi"/>
+                  <w:noProof/>
+                  <w:kern w:val="2"/>
+                  <w:sz w:val="24"/>
+                  <w:szCs w:val="24"/>
+                  <w:lang w:val="es-CL" w:eastAsia="es-CL" w:bidi="ar-SA"/>
+                  <w14:ligatures w14:val="standardContextual"/>
+                </w:rPr>
+              </w:pPr>
+              <w:hyperlink w:anchor="_Toc234404044" w:history="1">
+                <w:r>
+                  <w:rPr>
+                    <w:rStyle w:val="Hipervnculo"/>
+                    <w:noProof/>
+                  </w:rPr>
+                  <w:t>EJECUCIÓN DEL APLICATIVO DE VALIDACIÓN REM: Inicio del Proceso</w:t>
+                </w:r>
+                <w:r>
+                  <w:rPr>
+                    <w:noProof/>
+                    <w:webHidden/>
+                  </w:rPr>
+                  <w:tab/>
+                </w:r>
+                <w:r>
+                  <w:rPr>
+                    <w:noProof/>
+                    <w:webHidden/>
+                  </w:rPr>
+                  <w:fldChar w:fldCharType="begin"/>
+                </w:r>
+                <w:r>
+                  <w:rPr>
+                    <w:noProof/>
+                    <w:webHidden/>
+                  </w:rPr>
+                  <w:instrText xml:space="preserve"> PAGEREF _Toc234404044 \h </w:instrText>
+                </w:r>
+                <w:r>
+                  <w:rPr>
+                    <w:noProof/>
+                    <w:webHidden/>
+                  </w:rPr>
+                </w:r>
+                <w:r>
+                  <w:rPr>
+                    <w:noProof/>
+                    <w:webHidden/>
+                  </w:rPr>
+                  <w:fldChar w:fldCharType="separate"/>
+                </w:r>
+                <w:r>
+                  <w:rPr>
+                    <w:noProof/>
+                    <w:webHidden/>
+                  </w:rPr>
+                  <w:t>4</w:t>
+                </w:r>
+                <w:r>
+                  <w:rPr>
+                    <w:noProof/>
+                    <w:webHidden/>
+                  </w:rPr>
+                  <w:fldChar w:fldCharType="end"/>
+                </w:r>
+              </w:hyperlink>
+            </w:p>
+            <w:p>
+              <w:pPr>
+                <w:pStyle w:val="TDC1"/>
+                <w:tabs>
+                  <w:tab w:val="right" w:leader="dot" w:pos="8828"/>
+                </w:tabs>
+                <w:rPr>
+                  <w:rFonts w:asciiTheme="minorHAnsi" w:eastAsiaTheme="minorEastAsia" w:hAnsiTheme="minorHAnsi" w:cstheme="minorBidi"/>
+                  <w:noProof/>
+                  <w:kern w:val="2"/>
+                  <w:sz w:val="24"/>
+                  <w:szCs w:val="24"/>
+                  <w:lang w:val="es-CL" w:eastAsia="es-CL" w:bidi="ar-SA"/>
+                  <w14:ligatures w14:val="standardContextual"/>
+                </w:rPr>
+              </w:pPr>
+              <w:hyperlink w:anchor="_Toc234404045" w:history="1">
+                <w:r>
+                  <w:rPr>
+                    <w:rStyle w:val="Hipervnculo"/>
+                    <w:rFonts w:cs="Segoe UI Light"/>
                     <w:noProof/>
                   </w:rPr>
                   <w:t>EJECUCIÓN DEL APLICATIVO DE VALIDADOR CONSISTENCIAS REM: Archivos de Salida</w:t>
@@ -1863,7 +2073,7 @@
                     <w:noProof/>
                     <w:webHidden/>
                   </w:rPr>
-                  <w:instrText xml:space="preserve"> PAGEREF _Toc234333578 \h </w:instrText>
+                  <w:instrText xml:space="preserve"> PAGEREF _Toc234404045 \h </w:instrText>
                 </w:r>
                 <w:r>
                   <w:rPr>
@@ -1895,6 +2105,168 @@
               </w:hyperlink>
             </w:p>
             <w:p>
+              <w:pPr>
+                <w:pStyle w:val="TDC1"/>
+                <w:tabs>
+                  <w:tab w:val="right" w:leader="dot" w:pos="8828"/>
+                </w:tabs>
+                <w:rPr>
+                  <w:rFonts w:asciiTheme="minorHAnsi" w:eastAsiaTheme="minorEastAsia" w:hAnsiTheme="minorHAnsi" w:cstheme="minorBidi"/>
+                  <w:noProof/>
+                  <w:kern w:val="2"/>
+                  <w:sz w:val="24"/>
+                  <w:szCs w:val="24"/>
+                  <w:lang w:val="es-CL" w:eastAsia="es-CL" w:bidi="ar-SA"/>
+                  <w14:ligatures w14:val="standardContextual"/>
+                </w:rPr>
+              </w:pPr>
+              <w:hyperlink w:anchor="_Toc234404047" w:history="1">
+                <w:r>
+                  <w:rPr>
+                    <w:rStyle w:val="Hipervnculo"/>
+                    <w:noProof/>
+                  </w:rPr>
+                  <w:t>ESTRUCTURA REPORTE ERRORES-C</w:t>
+                </w:r>
+                <w:r>
+                  <w:rPr>
+                    <w:rStyle w:val="Hipervnculo"/>
+                    <w:noProof/>
+                  </w:rPr>
+                  <w:t>O</w:t>
+                </w:r>
+                <w:r>
+                  <w:rPr>
+                    <w:rStyle w:val="Hipervnculo"/>
+                    <w:noProof/>
+                  </w:rPr>
+                  <w:t>NSISTENCIAS-REM.XLSX:</w:t>
+                </w:r>
+                <w:r>
+                  <w:rPr>
+                    <w:noProof/>
+                    <w:webHidden/>
+                  </w:rPr>
+                  <w:tab/>
+                </w:r>
+                <w:r>
+                  <w:rPr>
+                    <w:noProof/>
+                    <w:webHidden/>
+                  </w:rPr>
+                  <w:fldChar w:fldCharType="begin"/>
+                </w:r>
+                <w:r>
+                  <w:rPr>
+                    <w:noProof/>
+                    <w:webHidden/>
+                  </w:rPr>
+                  <w:instrText xml:space="preserve"> PAGEREF _Toc234404047 \h </w:instrText>
+                </w:r>
+                <w:r>
+                  <w:rPr>
+                    <w:noProof/>
+                    <w:webHidden/>
+                  </w:rPr>
+                </w:r>
+                <w:r>
+                  <w:rPr>
+                    <w:noProof/>
+                    <w:webHidden/>
+                  </w:rPr>
+                  <w:fldChar w:fldCharType="separate"/>
+                </w:r>
+                <w:r>
+                  <w:rPr>
+                    <w:noProof/>
+                    <w:webHidden/>
+                  </w:rPr>
+                  <w:t>12</w:t>
+                </w:r>
+                <w:r>
+                  <w:rPr>
+                    <w:noProof/>
+                    <w:webHidden/>
+                  </w:rPr>
+                  <w:fldChar w:fldCharType="end"/>
+                </w:r>
+              </w:hyperlink>
+            </w:p>
+            <w:p>
+              <w:pPr>
+                <w:pStyle w:val="TDC1"/>
+                <w:tabs>
+                  <w:tab w:val="right" w:leader="dot" w:pos="8828"/>
+                </w:tabs>
+                <w:rPr>
+                  <w:rFonts w:asciiTheme="minorHAnsi" w:eastAsiaTheme="minorEastAsia" w:hAnsiTheme="minorHAnsi" w:cstheme="minorBidi"/>
+                  <w:noProof/>
+                  <w:kern w:val="2"/>
+                  <w:sz w:val="24"/>
+                  <w:szCs w:val="24"/>
+                  <w:lang w:val="es-CL" w:eastAsia="es-CL" w:bidi="ar-SA"/>
+                  <w14:ligatures w14:val="standardContextual"/>
+                </w:rPr>
+              </w:pPr>
+              <w:hyperlink w:anchor="_Toc234404048" w:history="1">
+                <w:r>
+                  <w:rPr>
+                    <w:rStyle w:val="Hipervnculo"/>
+                    <w:noProof/>
+                  </w:rPr>
+                  <w:t>EJECUCIÓN DEL APLICATIVO DE VALIDADOR CONSISTENCIAS REM: Directorios y archivos de salida de configuración.</w:t>
+                </w:r>
+                <w:r>
+                  <w:rPr>
+                    <w:noProof/>
+                    <w:webHidden/>
+                  </w:rPr>
+                  <w:tab/>
+                </w:r>
+                <w:r>
+                  <w:rPr>
+                    <w:noProof/>
+                    <w:webHidden/>
+                  </w:rPr>
+                  <w:fldChar w:fldCharType="begin"/>
+                </w:r>
+                <w:r>
+                  <w:rPr>
+                    <w:noProof/>
+                    <w:webHidden/>
+                  </w:rPr>
+                  <w:instrText xml:space="preserve"> PAGEREF _Toc234404048 \h </w:instrText>
+                </w:r>
+                <w:r>
+                  <w:rPr>
+                    <w:noProof/>
+                    <w:webHidden/>
+                  </w:rPr>
+                </w:r>
+                <w:r>
+                  <w:rPr>
+                    <w:noProof/>
+                    <w:webHidden/>
+                  </w:rPr>
+                  <w:fldChar w:fldCharType="separate"/>
+                </w:r>
+                <w:r>
+                  <w:rPr>
+                    <w:noProof/>
+                    <w:webHidden/>
+                  </w:rPr>
+                  <w:t>13</w:t>
+                </w:r>
+                <w:r>
+                  <w:rPr>
+                    <w:noProof/>
+                    <w:webHidden/>
+                  </w:rPr>
+                  <w:fldChar w:fldCharType="end"/>
+                </w:r>
+              </w:hyperlink>
+            </w:p>
+            <w:p>
               <w:r>
                 <w:rPr>
                   <w:b/>
@@ -1914,8 +2286,6 @@
         <w:p/>
         <w:p/>
         <w:p/>
-        <w:p/>
-        <w:p/>
       </w:sdtContent>
     </w:sdt>
     <w:p>
@@ -2031,71 +2401,158 @@
     </w:p>
     <w:p>
       <w:pPr>
+        <w:pStyle w:val="Titulo"/>
+        <w:rPr>
+          <w:del w:id="0" w:author="Karina Stapfer Jara" w:date="2025-11-11T14:48:00Z" w16du:dateUtc="2025-11-11T17:48:00Z"/>
+        </w:rPr>
+      </w:pPr>
+    </w:p>
+    <w:p>
+      <w:pPr>
+        <w:pStyle w:val="Titulo"/>
+        <w:rPr>
+          <w:rFonts w:cs="Segoe UI Light"/>
+          <w:sz w:val="20"/>
+          <w:szCs w:val="20"/>
+        </w:rPr>
+      </w:pPr>
+      <w:bookmarkStart w:id="1" w:name="_Toc234403681"/>
+      <w:bookmarkStart w:id="2" w:name="_Toc201653894"/>
+      <w:bookmarkStart w:id="3" w:name="_Toc213764890"/>
+      <w:bookmarkStart w:id="4" w:name="_Toc234404038"/>
+      <w:r>
+        <w:rPr>
+          <w:rFonts w:cs="Segoe UI Light"/>
+          <w:sz w:val="20"/>
+          <w:szCs w:val="20"/>
+        </w:rPr>
+        <w:t>INTRODUCCIÓN</w:t>
+      </w:r>
+      <w:bookmarkEnd w:id="1"/>
+      <w:bookmarkEnd w:id="4"/>
+    </w:p>
+    <w:p>
+      <w:pPr>
         <w:spacing w:line="276" w:lineRule="auto"/>
         <w:jc w:val="both"/>
-        <w:outlineLvl w:val="0"/>
-        <w:rPr>
-          <w:b/>
-          <w:bCs/>
-          <w:color w:val="2E74B5" w:themeColor="accent1" w:themeShade="BF"/>
-          <w:sz w:val="28"/>
-          <w:szCs w:val="28"/>
-        </w:rPr>
-      </w:pPr>
+        <w:rPr>
+          <w:rFonts w:ascii="Segoe UI Light" w:hAnsi="Segoe UI Light" w:cs="Segoe UI Light"/>
+          <w:sz w:val="20"/>
+          <w:szCs w:val="20"/>
+        </w:rPr>
+      </w:pPr>
+      <w:r>
+        <w:rPr>
+          <w:rFonts w:ascii="Segoe UI Light" w:hAnsi="Segoe UI Light" w:cs="Segoe UI Light"/>
+          <w:sz w:val="20"/>
+          <w:szCs w:val="20"/>
+        </w:rPr>
+        <w:lastRenderedPageBreak/>
+        <w:t xml:space="preserve">El aplicativo de validación de registro estadístico mensual </w:t>
+      </w:r>
+      <w:r>
+        <w:rPr>
+          <w:rFonts w:ascii="Segoe UI Light" w:hAnsi="Segoe UI Light" w:cs="Segoe UI Light"/>
+          <w:sz w:val="20"/>
+          <w:szCs w:val="20"/>
+        </w:rPr>
+        <w:t xml:space="preserve">(REM) </w:t>
+      </w:r>
+      <w:r>
+        <w:rPr>
+          <w:rFonts w:ascii="Segoe UI Light" w:hAnsi="Segoe UI Light" w:cs="Segoe UI Light"/>
+          <w:sz w:val="20"/>
+          <w:szCs w:val="20"/>
+        </w:rPr>
+        <w:t>en salud ha sido desarrollado con el objetivo de optimizar la revisión, consistencia y calidad de los datos reportados por los establecimientos de salud. Esta herramienta permite detectar errores, inconsistencias y omisiones en los registros, facilitando la validación oportuna de la información antes de su envío oficial. De esta manera, se fortalece la confiabilidad de las estadísticas sanitarias y se contribuye a una mejor toma de decisiones en el ámbito de la gestión en salud.</w:t>
+      </w:r>
+    </w:p>
+    <w:p>
+      <w:pPr>
+        <w:spacing w:line="276" w:lineRule="auto"/>
+        <w:jc w:val="center"/>
+        <w:rPr>
+          <w:rFonts w:ascii="Segoe UI Light" w:hAnsi="Segoe UI Light" w:cs="Segoe UI Light"/>
+          <w:sz w:val="20"/>
+          <w:szCs w:val="20"/>
+        </w:rPr>
+      </w:pPr>
+    </w:p>
+    <w:p>
+      <w:pPr>
+        <w:pStyle w:val="Titulo"/>
+        <w:rPr>
+          <w:rFonts w:cs="Segoe UI Light"/>
+          <w:sz w:val="20"/>
+          <w:szCs w:val="20"/>
+        </w:rPr>
+      </w:pPr>
+      <w:bookmarkStart w:id="5" w:name="_Toc234403682"/>
+      <w:bookmarkStart w:id="6" w:name="_Toc234404039"/>
+      <w:r>
+        <w:rPr>
+          <w:rFonts w:cs="Segoe UI Light"/>
+          <w:sz w:val="20"/>
+          <w:szCs w:val="20"/>
+        </w:rPr>
+        <w:t>ALCANCE</w:t>
+      </w:r>
+      <w:bookmarkEnd w:id="5"/>
+      <w:bookmarkEnd w:id="6"/>
     </w:p>
     <w:p>
       <w:pPr>
         <w:spacing w:line="276" w:lineRule="auto"/>
         <w:jc w:val="both"/>
-        <w:outlineLvl w:val="0"/>
-        <w:rPr>
-          <w:b/>
-          <w:bCs/>
-          <w:color w:val="2E74B5" w:themeColor="accent1" w:themeShade="BF"/>
-          <w:sz w:val="28"/>
-          <w:szCs w:val="28"/>
-        </w:rPr>
-      </w:pPr>
-    </w:p>
-    <w:p>
-      <w:pPr>
-        <w:rPr>
-          <w:del w:id="0" w:author="Karina Stapfer Jara" w:date="2025-11-11T14:48:00Z" w16du:dateUtc="2025-11-11T17:48:00Z"/>
-          <w:b/>
-          <w:bCs/>
-          <w:color w:val="2E74B5" w:themeColor="accent1" w:themeShade="BF"/>
-          <w:sz w:val="28"/>
-          <w:szCs w:val="28"/>
-        </w:rPr>
-      </w:pPr>
+        <w:rPr>
+          <w:rFonts w:ascii="Segoe UI Light" w:hAnsi="Segoe UI Light" w:cs="Segoe UI Light"/>
+          <w:sz w:val="20"/>
+          <w:szCs w:val="20"/>
+        </w:rPr>
+      </w:pPr>
+      <w:r>
+        <w:rPr>
+          <w:rFonts w:ascii="Segoe UI Light" w:hAnsi="Segoe UI Light" w:cs="Segoe UI Light"/>
+          <w:sz w:val="20"/>
+          <w:szCs w:val="20"/>
+        </w:rPr>
+        <w:t>El aplicativo está diseñado para ser utilizado en todos los establecimientos de la red asistencial, tanto de atención primaria como secundaria, facilitando la validación y consolidación de la información estadística mensual</w:t>
+      </w:r>
+      <w:r>
+        <w:rPr>
+          <w:rFonts w:ascii="Segoe UI Light" w:hAnsi="Segoe UI Light" w:cs="Segoe UI Light"/>
+          <w:sz w:val="20"/>
+          <w:szCs w:val="20"/>
+        </w:rPr>
+        <w:t xml:space="preserve"> previo al envío oficial al Subdepartamento de Estadística y Registros del Servicio de Salud Metropolitano Central. </w:t>
+      </w:r>
     </w:p>
     <w:p>
       <w:pPr>
         <w:spacing w:line="276" w:lineRule="auto"/>
         <w:jc w:val="both"/>
-        <w:outlineLvl w:val="0"/>
-        <w:rPr>
-          <w:rFonts w:ascii="Segoe UI Light" w:hAnsi="Segoe UI Light" w:cs="Segoe UI Light"/>
-          <w:b/>
-          <w:bCs/>
-          <w:sz w:val="20"/>
-          <w:szCs w:val="20"/>
-        </w:rPr>
-      </w:pPr>
-      <w:bookmarkStart w:id="1" w:name="_Toc234333574"/>
-      <w:bookmarkStart w:id="2" w:name="_Toc201653894"/>
-      <w:bookmarkStart w:id="3" w:name="_Toc213764890"/>
-      <w:r>
-        <w:rPr>
-          <w:rFonts w:ascii="Segoe UI Light" w:hAnsi="Segoe UI Light" w:cs="Segoe UI Light"/>
-          <w:b/>
-          <w:bCs/>
-          <w:sz w:val="20"/>
-          <w:szCs w:val="20"/>
-        </w:rPr>
-        <w:t>INTRODUCCIÓN</w:t>
-      </w:r>
-      <w:bookmarkEnd w:id="1"/>
+        <w:rPr>
+          <w:rFonts w:ascii="Segoe UI Light" w:hAnsi="Segoe UI Light" w:cs="Segoe UI Light"/>
+          <w:sz w:val="20"/>
+          <w:szCs w:val="20"/>
+        </w:rPr>
+      </w:pPr>
+      <w:r>
+        <w:rPr>
+          <w:rFonts w:ascii="Segoe UI Light" w:hAnsi="Segoe UI Light" w:cs="Segoe UI Light"/>
+          <w:sz w:val="20"/>
+          <w:szCs w:val="20"/>
+        </w:rPr>
+        <w:t xml:space="preserve">Así mismo es una herramienta que será utilizada para analizar y monitorear los datos desde el Subdepartamento de Estadística y Registros del Servicio de Salud Metropolitano Central una vez recibidos </w:t>
+      </w:r>
+      <w:r>
+        <w:rPr>
+          <w:rFonts w:ascii="Segoe UI Light" w:hAnsi="Segoe UI Light" w:cs="Segoe UI Light"/>
+          <w:sz w:val="20"/>
+          <w:szCs w:val="20"/>
+        </w:rPr>
+        <w:t>los archivos tanto en el periodo estadístico en curso como en correcciones REM.</w:t>
+      </w:r>
     </w:p>
     <w:p>
       <w:pPr>
@@ -2107,195 +2564,47 @@
           <w:szCs w:val="20"/>
         </w:rPr>
       </w:pPr>
-      <w:r>
-        <w:rPr>
-          <w:rFonts w:ascii="Segoe UI Light" w:hAnsi="Segoe UI Light" w:cs="Segoe UI Light"/>
-          <w:sz w:val="20"/>
-          <w:szCs w:val="20"/>
-        </w:rPr>
-        <w:t xml:space="preserve">El aplicativo de validación de registro estadístico mensual </w:t>
-      </w:r>
-      <w:r>
-        <w:rPr>
-          <w:rFonts w:ascii="Segoe UI Light" w:hAnsi="Segoe UI Light" w:cs="Segoe UI Light"/>
-          <w:sz w:val="20"/>
-          <w:szCs w:val="20"/>
-        </w:rPr>
-        <w:t xml:space="preserve">(REM) </w:t>
-      </w:r>
-      <w:r>
-        <w:rPr>
-          <w:rFonts w:ascii="Segoe UI Light" w:hAnsi="Segoe UI Light" w:cs="Segoe UI Light"/>
-          <w:sz w:val="20"/>
-          <w:szCs w:val="20"/>
-        </w:rPr>
-        <w:t>en salud ha sido desarrollado con el objetivo de optimizar la revisión, consistencia y calidad de los datos reportados por los establecimientos de salud. Esta herramienta permite detectar errores, inconsistencias y omisiones en los registros, facilitando la validación oportuna de la información antes de su envío oficial. De esta manera, se fortalece la confiabilidad de las estadísticas sanitarias y se contribuye a una mejor toma de decisiones en el ámbito de la gestión en salud.</w:t>
-      </w:r>
-    </w:p>
-    <w:p>
-      <w:pPr>
-        <w:spacing w:line="276" w:lineRule="auto"/>
-        <w:jc w:val="center"/>
-        <w:rPr>
-          <w:rFonts w:ascii="Segoe UI Light" w:hAnsi="Segoe UI Light" w:cs="Segoe UI Light"/>
-          <w:sz w:val="20"/>
-          <w:szCs w:val="20"/>
-        </w:rPr>
-      </w:pPr>
-    </w:p>
-    <w:p>
-      <w:pPr>
-        <w:spacing w:line="276" w:lineRule="auto"/>
-        <w:jc w:val="both"/>
-        <w:outlineLvl w:val="0"/>
-        <w:rPr>
-          <w:rFonts w:ascii="Segoe UI Light" w:hAnsi="Segoe UI Light" w:cs="Segoe UI Light"/>
-          <w:b/>
-          <w:bCs/>
-          <w:sz w:val="20"/>
-          <w:szCs w:val="20"/>
-        </w:rPr>
-      </w:pPr>
-      <w:bookmarkStart w:id="4" w:name="_Toc234333575"/>
-      <w:r>
-        <w:rPr>
-          <w:rFonts w:ascii="Segoe UI Light" w:hAnsi="Segoe UI Light" w:cs="Segoe UI Light"/>
-          <w:b/>
-          <w:bCs/>
-          <w:sz w:val="20"/>
-          <w:szCs w:val="20"/>
-        </w:rPr>
-        <w:t>ALCANCE</w:t>
-      </w:r>
-      <w:bookmarkEnd w:id="4"/>
-    </w:p>
-    <w:p>
-      <w:pPr>
-        <w:spacing w:line="276" w:lineRule="auto"/>
-        <w:jc w:val="both"/>
-        <w:rPr>
-          <w:rFonts w:ascii="Segoe UI Light" w:hAnsi="Segoe UI Light" w:cs="Segoe UI Light"/>
-          <w:sz w:val="20"/>
-          <w:szCs w:val="20"/>
-        </w:rPr>
-      </w:pPr>
-      <w:r>
-        <w:rPr>
-          <w:rFonts w:ascii="Segoe UI Light" w:hAnsi="Segoe UI Light" w:cs="Segoe UI Light"/>
-          <w:sz w:val="20"/>
-          <w:szCs w:val="20"/>
-        </w:rPr>
-        <w:t>El aplicativo está diseñado para ser utilizado en todos los establecimientos de la red asistencial, tanto de atención primaria como secundaria, facilitando la validación y consolidación de la información estadística mensual</w:t>
-      </w:r>
-      <w:r>
-        <w:rPr>
-          <w:rFonts w:ascii="Segoe UI Light" w:hAnsi="Segoe UI Light" w:cs="Segoe UI Light"/>
-          <w:sz w:val="20"/>
-          <w:szCs w:val="20"/>
-        </w:rPr>
-        <w:t xml:space="preserve"> previo al envío oficial al Subdepartamento de Estadística y Registros del Servicio de Salud Metropolitano Central. </w:t>
-      </w:r>
-    </w:p>
-    <w:p>
-      <w:pPr>
-        <w:spacing w:line="276" w:lineRule="auto"/>
-        <w:jc w:val="both"/>
-        <w:rPr>
-          <w:rFonts w:ascii="Segoe UI Light" w:hAnsi="Segoe UI Light" w:cs="Segoe UI Light"/>
-          <w:sz w:val="20"/>
-          <w:szCs w:val="20"/>
-        </w:rPr>
-      </w:pPr>
-      <w:r>
-        <w:rPr>
-          <w:rFonts w:ascii="Segoe UI Light" w:hAnsi="Segoe UI Light" w:cs="Segoe UI Light"/>
-          <w:sz w:val="20"/>
-          <w:szCs w:val="20"/>
-        </w:rPr>
-        <w:t xml:space="preserve">Así mismo es una herramienta que será utilizada para analizar y monitorear los datos desde el Subdepartamento de Estadística y Registros del Servicio de Salud Metropolitano Central una vez recibidos </w:t>
-      </w:r>
-      <w:r>
-        <w:rPr>
-          <w:rFonts w:ascii="Segoe UI Light" w:hAnsi="Segoe UI Light" w:cs="Segoe UI Light"/>
-          <w:sz w:val="20"/>
-          <w:szCs w:val="20"/>
-        </w:rPr>
-        <w:t>los archivos tanto en el periodo estadístico en curso como en correcciones REM.</w:t>
-      </w:r>
-    </w:p>
-    <w:p>
-      <w:pPr>
-        <w:spacing w:line="276" w:lineRule="auto"/>
-        <w:jc w:val="both"/>
-        <w:rPr>
-          <w:rFonts w:ascii="Segoe UI Light" w:hAnsi="Segoe UI Light" w:cs="Segoe UI Light"/>
-          <w:sz w:val="20"/>
-          <w:szCs w:val="20"/>
-        </w:rPr>
-      </w:pPr>
-    </w:p>
-    <w:p>
-      <w:pPr>
-        <w:spacing w:line="276" w:lineRule="auto"/>
-        <w:jc w:val="both"/>
-        <w:outlineLvl w:val="0"/>
-        <w:rPr>
-          <w:rFonts w:ascii="Segoe UI Light" w:hAnsi="Segoe UI Light" w:cs="Segoe UI Light"/>
-          <w:b/>
-          <w:bCs/>
-          <w:sz w:val="20"/>
-          <w:szCs w:val="20"/>
-        </w:rPr>
-      </w:pPr>
-      <w:bookmarkStart w:id="5" w:name="_Toc213764892"/>
-      <w:bookmarkStart w:id="6" w:name="_Toc234333576"/>
-      <w:r>
-        <w:rPr>
-          <w:rFonts w:ascii="Segoe UI Light" w:hAnsi="Segoe UI Light" w:cs="Segoe UI Light"/>
-          <w:b/>
-          <w:bCs/>
-          <w:sz w:val="20"/>
-          <w:szCs w:val="20"/>
-        </w:rPr>
+    </w:p>
+    <w:p>
+      <w:pPr>
+        <w:pStyle w:val="Titulo"/>
+      </w:pPr>
+      <w:bookmarkStart w:id="7" w:name="_Toc213764892"/>
+      <w:bookmarkStart w:id="8" w:name="_Toc234403683"/>
+      <w:bookmarkStart w:id="9" w:name="_Toc234404040"/>
+      <w:r>
         <w:t>DESCRIPCIÓN DEL APLICATIVO DE VALIDACIÓN REM</w:t>
       </w:r>
-      <w:bookmarkEnd w:id="5"/>
-      <w:bookmarkEnd w:id="6"/>
-    </w:p>
-    <w:p>
-      <w:pPr>
-        <w:pStyle w:val="Prrafodelista"/>
-        <w:numPr>
-          <w:ilvl w:val="0"/>
-          <w:numId w:val="12"/>
-        </w:numPr>
-        <w:rPr>
-          <w:rFonts w:ascii="Segoe UI Light" w:hAnsi="Segoe UI Light" w:cs="Segoe UI Light"/>
+      <w:bookmarkEnd w:id="7"/>
+      <w:bookmarkEnd w:id="8"/>
+      <w:bookmarkEnd w:id="9"/>
+    </w:p>
+    <w:p>
+      <w:pPr>
+        <w:pStyle w:val="Titulo"/>
+        <w:rPr>
+          <w:rFonts w:cs="Segoe UI Light"/>
           <w:sz w:val="20"/>
           <w:szCs w:val="20"/>
           <w:u w:val="single"/>
         </w:rPr>
       </w:pPr>
-      <w:r>
-        <w:rPr>
-          <w:rFonts w:ascii="Segoe UI Light" w:hAnsi="Segoe UI Light" w:cs="Segoe UI Light"/>
-          <w:sz w:val="20"/>
-          <w:szCs w:val="20"/>
-          <w:u w:val="single"/>
+      <w:bookmarkStart w:id="10" w:name="_Toc234404041"/>
+      <w:r>
+        <w:rPr>
+          <w:b w:val="0"/>
+          <w:bCs w:val="0"/>
+        </w:rPr>
+        <w:t>1.</w:t>
+      </w:r>
+      <w:r>
+        <w:rPr>
+          <w:b w:val="0"/>
+          <w:bCs w:val="0"/>
         </w:rPr>
         <w:t>OBJETIVOS:</w:t>
       </w:r>
-    </w:p>
-    <w:p>
-      <w:pPr>
-        <w:pStyle w:val="Prrafodelista"/>
-        <w:rPr>
-          <w:rFonts w:ascii="Segoe UI Light" w:hAnsi="Segoe UI Light" w:cs="Segoe UI Light"/>
-          <w:sz w:val="20"/>
-          <w:szCs w:val="20"/>
-          <w:u w:val="single"/>
-        </w:rPr>
-      </w:pPr>
+      <w:bookmarkEnd w:id="10"/>
     </w:p>
     <w:p>
       <w:pPr>
@@ -2429,9 +2738,8 @@
           <w:sz w:val="20"/>
           <w:szCs w:val="20"/>
         </w:rPr>
-        <w:t>validador-consistencias-rem-</w:t>
-      </w:r>
-      <w:proofErr w:type="gramStart"/>
+        <w:t>validador-consistencias-rem-ver.&lt;número_de_versión&gt;</w:t>
+      </w:r>
       <w:r>
         <w:rPr>
           <w:rFonts w:ascii="Segoe UI Light" w:hAnsi="Segoe UI Light" w:cs="Segoe UI Light"/>
@@ -2442,93 +2750,46 @@
           <w:sz w:val="20"/>
           <w:szCs w:val="20"/>
         </w:rPr>
-        <w:t>ver.&lt;</w:t>
-      </w:r>
-      <w:proofErr w:type="spellStart"/>
-      <w:proofErr w:type="gramEnd"/>
-      <w:r>
+        <w:t>.exe”.</w:t>
+      </w:r>
+    </w:p>
+    <w:p>
+      <w:pPr>
         <w:rPr>
           <w:rFonts w:ascii="Segoe UI Light" w:hAnsi="Segoe UI Light" w:cs="Segoe UI Light"/>
           <w:b/>
           <w:bCs/>
-          <w:i/>
-          <w:iCs/>
-          <w:sz w:val="20"/>
-          <w:szCs w:val="20"/>
-        </w:rPr>
-        <w:t>número_de_versión</w:t>
-      </w:r>
-      <w:proofErr w:type="spellEnd"/>
-      <w:r>
-        <w:rPr>
-          <w:rFonts w:ascii="Segoe UI Light" w:hAnsi="Segoe UI Light" w:cs="Segoe UI Light"/>
-          <w:b/>
-          <w:bCs/>
-          <w:i/>
-          <w:iCs/>
-          <w:sz w:val="20"/>
-          <w:szCs w:val="20"/>
-        </w:rPr>
-        <w:t>&gt;</w:t>
-      </w:r>
-      <w:r>
-        <w:rPr>
-          <w:rFonts w:ascii="Segoe UI Light" w:hAnsi="Segoe UI Light" w:cs="Segoe UI Light"/>
-          <w:b/>
-          <w:bCs/>
-          <w:i/>
-          <w:iCs/>
-          <w:sz w:val="20"/>
-          <w:szCs w:val="20"/>
-        </w:rPr>
-        <w:t>.exe”.</w:t>
-      </w:r>
-    </w:p>
-    <w:p>
-      <w:pPr>
-        <w:rPr>
-          <w:rFonts w:ascii="Segoe UI Light" w:hAnsi="Segoe UI Light" w:cs="Segoe UI Light"/>
-          <w:b/>
-          <w:bCs/>
-          <w:sz w:val="20"/>
-          <w:szCs w:val="20"/>
-        </w:rPr>
-      </w:pPr>
-    </w:p>
-    <w:p>
-      <w:pPr>
-        <w:pStyle w:val="Prrafodelista"/>
-        <w:numPr>
-          <w:ilvl w:val="0"/>
-          <w:numId w:val="12"/>
-        </w:numPr>
-        <w:rPr>
-          <w:rFonts w:ascii="Segoe UI Light" w:hAnsi="Segoe UI Light" w:cs="Segoe UI Light"/>
+          <w:sz w:val="20"/>
+          <w:szCs w:val="20"/>
+        </w:rPr>
+      </w:pPr>
+    </w:p>
+    <w:p>
+      <w:pPr>
+        <w:pStyle w:val="Titulo"/>
+        <w:rPr>
+          <w:rFonts w:cs="Segoe UI Light"/>
           <w:sz w:val="20"/>
           <w:szCs w:val="20"/>
           <w:u w:val="single"/>
         </w:rPr>
       </w:pPr>
-      <w:r>
-        <w:rPr>
-          <w:rFonts w:ascii="Segoe UI Light" w:hAnsi="Segoe UI Light" w:cs="Segoe UI Light"/>
-          <w:sz w:val="20"/>
-          <w:szCs w:val="20"/>
-          <w:u w:val="single"/>
+      <w:bookmarkStart w:id="11" w:name="_Toc234404042"/>
+      <w:r>
+        <w:rPr>
+          <w:b w:val="0"/>
+          <w:bCs w:val="0"/>
+        </w:rPr>
+        <w:t>2.</w:t>
+      </w:r>
+      <w:r>
+        <w:rPr>
+          <w:b w:val="0"/>
+          <w:bCs w:val="0"/>
         </w:rPr>
         <w:t>FUNCIONALIDADES:</w:t>
       </w:r>
-    </w:p>
-    <w:p>
-      <w:pPr>
-        <w:pStyle w:val="Prrafodelista"/>
-        <w:rPr>
-          <w:rFonts w:ascii="Segoe UI Light" w:hAnsi="Segoe UI Light" w:cs="Segoe UI Light"/>
-          <w:sz w:val="20"/>
-          <w:szCs w:val="20"/>
-          <w:u w:val="single"/>
-        </w:rPr>
-      </w:pPr>
+      <w:bookmarkEnd w:id="11"/>
     </w:p>
     <w:p>
       <w:pPr>
@@ -2642,7 +2903,6 @@
           <w:sz w:val="20"/>
           <w:szCs w:val="20"/>
         </w:rPr>
-        <w:lastRenderedPageBreak/>
         <w:t>El archivo de establecimientos oficiales de la red de salud según documento oficial en DEIS.</w:t>
       </w:r>
     </w:p>
@@ -2666,6 +2926,7 @@
           <w:sz w:val="20"/>
           <w:szCs w:val="20"/>
         </w:rPr>
+        <w:lastRenderedPageBreak/>
         <w:t>Un consolidado de nombres “no oficiales” usados por cada establecimiento y la hoja “</w:t>
       </w:r>
       <w:r>
@@ -2745,28 +3006,28 @@
     </w:p>
     <w:p>
       <w:pPr>
-        <w:pStyle w:val="Prrafodelista"/>
-        <w:numPr>
-          <w:ilvl w:val="0"/>
-          <w:numId w:val="12"/>
-        </w:numPr>
-        <w:spacing w:after="160" w:line="278" w:lineRule="auto"/>
-        <w:rPr>
-          <w:rFonts w:ascii="Segoe UI Light" w:hAnsi="Segoe UI Light" w:cs="Segoe UI Light"/>
-          <w:sz w:val="20"/>
-          <w:szCs w:val="20"/>
-          <w:u w:val="single"/>
-        </w:rPr>
-      </w:pPr>
-      <w:r>
-        <w:rPr>
-          <w:rFonts w:ascii="Segoe UI Light" w:hAnsi="Segoe UI Light" w:cs="Segoe UI Light"/>
-          <w:sz w:val="20"/>
-          <w:szCs w:val="20"/>
-          <w:u w:val="single"/>
+        <w:pStyle w:val="Titulo"/>
+        <w:rPr>
+          <w:b w:val="0"/>
+          <w:bCs w:val="0"/>
+        </w:rPr>
+      </w:pPr>
+      <w:bookmarkStart w:id="12" w:name="_Toc234404043"/>
+      <w:r>
+        <w:rPr>
+          <w:b w:val="0"/>
+          <w:bCs w:val="0"/>
+        </w:rPr>
+        <w:t>3.</w:t>
+      </w:r>
+      <w:r>
+        <w:rPr>
+          <w:b w:val="0"/>
+          <w:bCs w:val="0"/>
         </w:rPr>
         <w:t>REQUISITOS:</w:t>
       </w:r>
+      <w:bookmarkEnd w:id="12"/>
     </w:p>
     <w:p>
       <w:pPr>
@@ -2993,8 +3254,6 @@
           <w:szCs w:val="20"/>
         </w:rPr>
       </w:pPr>
-      <w:proofErr w:type="spellStart"/>
-      <w:proofErr w:type="gramStart"/>
       <w:r>
         <w:rPr>
           <w:rFonts w:ascii="Segoe UI Light" w:hAnsi="Segoe UI Light" w:cs="Segoe UI Light"/>
@@ -3003,19 +3262,7 @@
           <w:sz w:val="20"/>
           <w:szCs w:val="20"/>
         </w:rPr>
-        <w:t>control.json</w:t>
-      </w:r>
-      <w:proofErr w:type="spellEnd"/>
-      <w:proofErr w:type="gramEnd"/>
-      <w:r>
-        <w:rPr>
-          <w:rFonts w:ascii="Segoe UI Light" w:hAnsi="Segoe UI Light" w:cs="Segoe UI Light"/>
-          <w:b/>
-          <w:bCs/>
-          <w:sz w:val="20"/>
-          <w:szCs w:val="20"/>
-        </w:rPr>
-        <w:t>:</w:t>
+        <w:t>control.json:</w:t>
       </w:r>
       <w:r>
         <w:rPr>
@@ -3050,31 +3297,7 @@
           <w:sz w:val="20"/>
           <w:szCs w:val="20"/>
         </w:rPr>
-        <w:t>control-</w:t>
-      </w:r>
-      <w:proofErr w:type="spellStart"/>
-      <w:proofErr w:type="gramStart"/>
-      <w:r>
-        <w:rPr>
-          <w:rFonts w:ascii="Segoe UI Light" w:hAnsi="Segoe UI Light" w:cs="Segoe UI Light"/>
-          <w:b/>
-          <w:bCs/>
-          <w:sz w:val="20"/>
-          <w:szCs w:val="20"/>
-        </w:rPr>
-        <w:t>versiones.json</w:t>
-      </w:r>
-      <w:proofErr w:type="spellEnd"/>
-      <w:proofErr w:type="gramEnd"/>
-      <w:r>
-        <w:rPr>
-          <w:rFonts w:ascii="Segoe UI Light" w:hAnsi="Segoe UI Light" w:cs="Segoe UI Light"/>
-          <w:b/>
-          <w:bCs/>
-          <w:sz w:val="20"/>
-          <w:szCs w:val="20"/>
-        </w:rPr>
-        <w:t>:</w:t>
+        <w:t>control-versiones.json:</w:t>
       </w:r>
       <w:r>
         <w:rPr>
@@ -3447,13 +3670,39 @@
           <w:szCs w:val="20"/>
         </w:rPr>
       </w:pPr>
-      <w:bookmarkStart w:id="7" w:name="_Toc213764893"/>
-    </w:p>
-    <w:p>
-      <w:pPr>
-        <w:spacing w:line="276" w:lineRule="auto"/>
+      <w:bookmarkStart w:id="13" w:name="_Toc213764893"/>
+    </w:p>
+    <w:p>
+      <w:pPr>
+        <w:pStyle w:val="Titulo"/>
+      </w:pPr>
+      <w:bookmarkStart w:id="14" w:name="_Toc234403684"/>
+      <w:bookmarkStart w:id="15" w:name="_Toc234404044"/>
+      <w:r>
+        <w:t>EJECUCIÓN DEL APLICATIVO DE VALIDACIÓN REM: Inicio del Proceso</w:t>
+      </w:r>
+      <w:bookmarkEnd w:id="13"/>
+      <w:bookmarkEnd w:id="14"/>
+      <w:bookmarkEnd w:id="15"/>
+    </w:p>
+    <w:p>
+      <w:pPr>
         <w:jc w:val="both"/>
-        <w:outlineLvl w:val="0"/>
+        <w:rPr>
+          <w:rFonts w:ascii="Segoe UI Light" w:hAnsi="Segoe UI Light" w:cs="Segoe UI Light"/>
+          <w:sz w:val="20"/>
+          <w:szCs w:val="20"/>
+        </w:rPr>
+      </w:pPr>
+      <w:r>
+        <w:rPr>
+          <w:rFonts w:ascii="Segoe UI Light" w:hAnsi="Segoe UI Light" w:cs="Segoe UI Light"/>
+          <w:sz w:val="20"/>
+          <w:szCs w:val="20"/>
+        </w:rPr>
+        <w:t xml:space="preserve">Antes de ejecutar el aplicativo, </w:t>
+      </w:r>
+      <w:r>
         <w:rPr>
           <w:rFonts w:ascii="Segoe UI Light" w:hAnsi="Segoe UI Light" w:cs="Segoe UI Light"/>
           <w:b/>
@@ -3461,8 +3710,16 @@
           <w:sz w:val="20"/>
           <w:szCs w:val="20"/>
         </w:rPr>
-      </w:pPr>
-      <w:bookmarkStart w:id="8" w:name="_Toc234333577"/>
+        <w:t>el usuario debe asegurarse de</w:t>
+      </w:r>
+      <w:r>
+        <w:rPr>
+          <w:rFonts w:ascii="Segoe UI Light" w:hAnsi="Segoe UI Light" w:cs="Segoe UI Light"/>
+          <w:sz w:val="20"/>
+          <w:szCs w:val="20"/>
+        </w:rPr>
+        <w:t xml:space="preserve"> </w:t>
+      </w:r>
       <w:r>
         <w:rPr>
           <w:rFonts w:ascii="Segoe UI Light" w:hAnsi="Segoe UI Light" w:cs="Segoe UI Light"/>
@@ -3471,10 +3728,16 @@
           <w:sz w:val="20"/>
           <w:szCs w:val="20"/>
         </w:rPr>
-        <w:t>EJECUCIÓN DEL APLICATIVO DE VALIDACIÓN REM: Inicio del Proceso</w:t>
-      </w:r>
-      <w:bookmarkEnd w:id="7"/>
-      <w:bookmarkEnd w:id="8"/>
+        <w:t>cerrar todos los archivos</w:t>
+      </w:r>
+      <w:r>
+        <w:rPr>
+          <w:rFonts w:ascii="Segoe UI Light" w:hAnsi="Segoe UI Light" w:cs="Segoe UI Light"/>
+          <w:sz w:val="20"/>
+          <w:szCs w:val="20"/>
+        </w:rPr>
+        <w:t xml:space="preserve"> que pertenezcan al directorio del aplicativo y que hayan sido utilizados en procesos anteriores.</w:t>
+      </w:r>
     </w:p>
     <w:p>
       <w:pPr>
@@ -3491,7 +3754,26 @@
           <w:sz w:val="20"/>
           <w:szCs w:val="20"/>
         </w:rPr>
-        <w:t xml:space="preserve">Antes de ejecutar el aplicativo, </w:t>
+        <w:t>En caso de requerir acceso a dichos archivos mientras el aplicativo está en uso, se recomienda copiarlos y utilizarlos desde un directorio distinto, para evitar conflictos en la ejecución y generación de reportes.</w:t>
+      </w:r>
+    </w:p>
+    <w:p>
+      <w:pPr>
+        <w:jc w:val="both"/>
+        <w:rPr>
+          <w:rFonts w:ascii="Segoe UI Light" w:hAnsi="Segoe UI Light" w:cs="Segoe UI Light"/>
+          <w:sz w:val="20"/>
+          <w:szCs w:val="20"/>
+        </w:rPr>
+      </w:pPr>
+      <w:r>
+        <w:rPr>
+          <w:rFonts w:ascii="Segoe UI Light" w:hAnsi="Segoe UI Light" w:cs="Segoe UI Light"/>
+          <w:sz w:val="20"/>
+          <w:szCs w:val="20"/>
+        </w:rPr>
+        <w:lastRenderedPageBreak/>
+        <w:t>Una vez verificada la existencia y correcta organización de la estructura descrita en el apartado</w:t>
       </w:r>
       <w:r>
         <w:rPr>
@@ -3501,7 +3783,7 @@
           <w:sz w:val="20"/>
           <w:szCs w:val="20"/>
         </w:rPr>
-        <w:t>el usuario debe asegurarse de</w:t>
+        <w:t xml:space="preserve"> "Requisitos para la ejecución del aplicativo",</w:t>
       </w:r>
       <w:r>
         <w:rPr>
@@ -3510,6 +3792,14 @@
           <w:szCs w:val="20"/>
         </w:rPr>
         <w:t xml:space="preserve"> </w:t>
+      </w:r>
+      <w:r>
+        <w:rPr>
+          <w:rFonts w:ascii="Segoe UI Light" w:hAnsi="Segoe UI Light" w:cs="Segoe UI Light"/>
+          <w:sz w:val="20"/>
+          <w:szCs w:val="20"/>
+        </w:rPr>
+        <w:t xml:space="preserve">el usuario debe cargar en el directorio </w:t>
       </w:r>
       <w:r>
         <w:rPr>
@@ -3519,87 +3809,6 @@
           <w:sz w:val="20"/>
           <w:szCs w:val="20"/>
         </w:rPr>
-        <w:t>cerrar todos los archivos</w:t>
-      </w:r>
-      <w:r>
-        <w:rPr>
-          <w:rFonts w:ascii="Segoe UI Light" w:hAnsi="Segoe UI Light" w:cs="Segoe UI Light"/>
-          <w:sz w:val="20"/>
-          <w:szCs w:val="20"/>
-        </w:rPr>
-        <w:t xml:space="preserve"> que pertenezcan al directorio del aplicativo y que hayan sido utilizados en procesos anteriores.</w:t>
-      </w:r>
-    </w:p>
-    <w:p>
-      <w:pPr>
-        <w:jc w:val="both"/>
-        <w:rPr>
-          <w:rFonts w:ascii="Segoe UI Light" w:hAnsi="Segoe UI Light" w:cs="Segoe UI Light"/>
-          <w:sz w:val="20"/>
-          <w:szCs w:val="20"/>
-        </w:rPr>
-      </w:pPr>
-      <w:r>
-        <w:rPr>
-          <w:rFonts w:ascii="Segoe UI Light" w:hAnsi="Segoe UI Light" w:cs="Segoe UI Light"/>
-          <w:sz w:val="20"/>
-          <w:szCs w:val="20"/>
-        </w:rPr>
-        <w:t>En caso de requerir acceso a dichos archivos mientras el aplicativo está en uso, se recomienda copiarlos y utilizarlos desde un directorio distinto, para evitar conflictos en la ejecución y generación de reportes.</w:t>
-      </w:r>
-    </w:p>
-    <w:p>
-      <w:pPr>
-        <w:jc w:val="both"/>
-        <w:rPr>
-          <w:rFonts w:ascii="Segoe UI Light" w:hAnsi="Segoe UI Light" w:cs="Segoe UI Light"/>
-          <w:sz w:val="20"/>
-          <w:szCs w:val="20"/>
-        </w:rPr>
-      </w:pPr>
-      <w:r>
-        <w:rPr>
-          <w:rFonts w:ascii="Segoe UI Light" w:hAnsi="Segoe UI Light" w:cs="Segoe UI Light"/>
-          <w:sz w:val="20"/>
-          <w:szCs w:val="20"/>
-        </w:rPr>
-        <w:lastRenderedPageBreak/>
-        <w:t>Una vez verificada la existencia y correcta organización de la estructura descrita en el apartado</w:t>
-      </w:r>
-      <w:r>
-        <w:rPr>
-          <w:rFonts w:ascii="Segoe UI Light" w:hAnsi="Segoe UI Light" w:cs="Segoe UI Light"/>
-          <w:b/>
-          <w:bCs/>
-          <w:sz w:val="20"/>
-          <w:szCs w:val="20"/>
-        </w:rPr>
-        <w:t xml:space="preserve"> "Requisitos para la ejecución del aplicativo",</w:t>
-      </w:r>
-      <w:r>
-        <w:rPr>
-          <w:rFonts w:ascii="Segoe UI Light" w:hAnsi="Segoe UI Light" w:cs="Segoe UI Light"/>
-          <w:sz w:val="20"/>
-          <w:szCs w:val="20"/>
-        </w:rPr>
-        <w:t xml:space="preserve"> </w:t>
-      </w:r>
-      <w:r>
-        <w:rPr>
-          <w:rFonts w:ascii="Segoe UI Light" w:hAnsi="Segoe UI Light" w:cs="Segoe UI Light"/>
-          <w:sz w:val="20"/>
-          <w:szCs w:val="20"/>
-        </w:rPr>
-        <w:t xml:space="preserve">el usuario debe cargar en el directorio </w:t>
-      </w:r>
-      <w:r>
-        <w:rPr>
-          <w:rFonts w:ascii="Segoe UI Light" w:hAnsi="Segoe UI Light" w:cs="Segoe UI Light"/>
-          <w:b/>
-          <w:bCs/>
-          <w:sz w:val="20"/>
-          <w:szCs w:val="20"/>
-        </w:rPr>
         <w:t>rem</w:t>
       </w:r>
       <w:r>
@@ -3706,25 +3915,7 @@
           <w:sz w:val="20"/>
           <w:szCs w:val="20"/>
         </w:rPr>
-        <w:t>Posteriormente, el usuario podrá ejecutar el archivo "validador-consistencias-rem-ver&lt;</w:t>
-      </w:r>
-      <w:proofErr w:type="spellStart"/>
-      <w:r>
-        <w:rPr>
-          <w:rFonts w:ascii="Segoe UI Light" w:hAnsi="Segoe UI Light" w:cs="Segoe UI Light"/>
-          <w:sz w:val="20"/>
-          <w:szCs w:val="20"/>
-        </w:rPr>
-        <w:t>número_de_versión</w:t>
-      </w:r>
-      <w:proofErr w:type="spellEnd"/>
-      <w:r>
-        <w:rPr>
-          <w:rFonts w:ascii="Segoe UI Light" w:hAnsi="Segoe UI Light" w:cs="Segoe UI Light"/>
-          <w:sz w:val="20"/>
-          <w:szCs w:val="20"/>
-        </w:rPr>
-        <w:t>&gt;.exe".</w:t>
+        <w:t>Posteriormente, el usuario podrá ejecutar el archivo "validador-consistencias-rem-ver&lt;número_de_versión&gt;.exe".</w:t>
       </w:r>
     </w:p>
     <w:p>
@@ -3993,61 +4184,40 @@
     </w:p>
     <w:p>
       <w:pPr>
-        <w:rPr>
-          <w:b/>
-          <w:bCs/>
-          <w:sz w:val="20"/>
-          <w:szCs w:val="20"/>
-        </w:rPr>
-      </w:pPr>
-    </w:p>
-    <w:p>
-      <w:pPr>
-        <w:spacing w:line="276" w:lineRule="auto"/>
-        <w:jc w:val="both"/>
-        <w:outlineLvl w:val="0"/>
-        <w:rPr>
-          <w:rFonts w:ascii="Segoe UI Light" w:hAnsi="Segoe UI Light" w:cs="Segoe UI Light"/>
-          <w:b/>
-          <w:bCs/>
-          <w:sz w:val="20"/>
-          <w:szCs w:val="20"/>
-        </w:rPr>
-      </w:pPr>
-      <w:bookmarkStart w:id="9" w:name="_Toc213764894"/>
-      <w:bookmarkStart w:id="10" w:name="_Toc234333578"/>
-      <w:r>
-        <w:rPr>
-          <w:rFonts w:ascii="Segoe UI Light" w:hAnsi="Segoe UI Light" w:cs="Segoe UI Light"/>
-          <w:b/>
-          <w:bCs/>
-          <w:sz w:val="20"/>
-          <w:szCs w:val="20"/>
+        <w:pStyle w:val="Titulo"/>
+      </w:pPr>
+    </w:p>
+    <w:p>
+      <w:pPr>
+        <w:pStyle w:val="Titulo"/>
+        <w:rPr>
+          <w:rFonts w:cs="Segoe UI Light"/>
+        </w:rPr>
+      </w:pPr>
+      <w:bookmarkStart w:id="16" w:name="_Toc213764894"/>
+      <w:bookmarkStart w:id="17" w:name="_Toc234403685"/>
+      <w:bookmarkStart w:id="18" w:name="_Toc234404045"/>
+      <w:r>
+        <w:rPr>
+          <w:rFonts w:cs="Segoe UI Light"/>
         </w:rPr>
         <w:t>EJECUCIÓN DEL APLICATIVO DE VALIDA</w:t>
       </w:r>
       <w:r>
         <w:rPr>
-          <w:rFonts w:ascii="Segoe UI Light" w:hAnsi="Segoe UI Light" w:cs="Segoe UI Light"/>
-          <w:b/>
-          <w:bCs/>
-          <w:sz w:val="20"/>
-          <w:szCs w:val="20"/>
+          <w:rFonts w:cs="Segoe UI Light"/>
         </w:rPr>
         <w:t xml:space="preserve">DOR CONSISTENCIAS </w:t>
       </w:r>
       <w:r>
         <w:rPr>
-          <w:rFonts w:ascii="Segoe UI Light" w:hAnsi="Segoe UI Light" w:cs="Segoe UI Light"/>
-          <w:b/>
-          <w:bCs/>
-          <w:sz w:val="20"/>
-          <w:szCs w:val="20"/>
+          <w:rFonts w:cs="Segoe UI Light"/>
         </w:rPr>
         <w:t>REM: Archivos de Salida</w:t>
       </w:r>
-      <w:bookmarkEnd w:id="9"/>
-      <w:bookmarkEnd w:id="10"/>
+      <w:bookmarkEnd w:id="16"/>
+      <w:bookmarkEnd w:id="17"/>
+      <w:bookmarkEnd w:id="18"/>
     </w:p>
     <w:p>
       <w:pPr>
@@ -4356,7 +4526,7 @@
         </w:rPr>
         <w:t>Figura 4: Directorio resultados.</w:t>
       </w:r>
-      <w:bookmarkStart w:id="11" w:name="_Hlk212213707"/>
+      <w:bookmarkStart w:id="19" w:name="_Hlk212213707"/>
     </w:p>
     <w:p>
       <w:pPr>
@@ -4369,27 +4539,24 @@
     </w:p>
     <w:p>
       <w:pPr>
-        <w:jc w:val="both"/>
-        <w:rPr>
-          <w:rFonts w:ascii="Segoe UI Light" w:hAnsi="Segoe UI Light" w:cs="Segoe UI Light"/>
-          <w:sz w:val="20"/>
-          <w:szCs w:val="20"/>
-          <w:u w:val="single"/>
-        </w:rPr>
-      </w:pPr>
-      <w:r>
-        <w:rPr>
-          <w:rFonts w:ascii="Segoe UI Light" w:hAnsi="Segoe UI Light" w:cs="Segoe UI Light"/>
-          <w:sz w:val="20"/>
-          <w:szCs w:val="20"/>
-          <w:u w:val="single"/>
-        </w:rPr>
-        <w:t>Estructura reporte Resultados-Validación.xlsx:</w:t>
-      </w:r>
-    </w:p>
-    <w:p>
-      <w:pPr>
-        <w:jc w:val="both"/>
+        <w:pStyle w:val="Titulo"/>
+        <w:rPr>
+          <w:b w:val="0"/>
+          <w:bCs w:val="0"/>
+        </w:rPr>
+      </w:pPr>
+      <w:bookmarkStart w:id="20" w:name="_Toc234404046"/>
+      <w:r>
+        <w:rPr>
+          <w:b w:val="0"/>
+          <w:bCs w:val="0"/>
+        </w:rPr>
+        <w:t>ESTRUCTURA REPORTE RESULTADOS-VALIDACIÓN.XLSX:</w:t>
+      </w:r>
+      <w:bookmarkEnd w:id="20"/>
+    </w:p>
+    <w:p>
+      <w:pPr>
         <w:rPr>
           <w:rFonts w:ascii="Segoe UI Light" w:hAnsi="Segoe UI Light" w:cs="Segoe UI Light"/>
           <w:sz w:val="20"/>
@@ -4472,7 +4639,7 @@
         </w:rPr>
         <w:t>sta hoja contiene los archivos que han sido clasificados como inválidos</w:t>
       </w:r>
-      <w:ins w:id="12" w:author="Karina Stapfer Jara" w:date="2025-11-11T14:41:00Z" w16du:dateUtc="2025-11-11T17:41:00Z">
+      <w:ins w:id="21" w:author="Karina Stapfer Jara" w:date="2025-11-11T14:41:00Z" w16du:dateUtc="2025-11-11T17:41:00Z">
         <w:r>
           <w:rPr>
             <w:rFonts w:ascii="Segoe UI Light" w:hAnsi="Segoe UI Light" w:cs="Segoe UI Light"/>
@@ -4490,7 +4657,7 @@
         </w:rPr>
         <w:t xml:space="preserve"> por alguna de las siguientes razones:</w:t>
       </w:r>
-      <w:bookmarkEnd w:id="11"/>
+      <w:bookmarkEnd w:id="19"/>
     </w:p>
     <w:p>
       <w:pPr>
@@ -4698,7 +4865,7 @@
           <w:szCs w:val="20"/>
         </w:rPr>
       </w:pPr>
-      <w:ins w:id="13" w:author="Karina Stapfer Jara" w:date="2025-11-11T14:40:00Z" w16du:dateUtc="2025-11-11T17:40:00Z">
+      <w:ins w:id="22" w:author="Karina Stapfer Jara" w:date="2025-11-11T14:40:00Z" w16du:dateUtc="2025-11-11T17:40:00Z">
         <w:r>
           <w:rPr>
             <w:rFonts w:ascii="Segoe UI Light" w:hAnsi="Segoe UI Light" w:cs="Segoe UI Light"/>
@@ -5182,29 +5349,7 @@
           <w:sz w:val="20"/>
           <w:szCs w:val="20"/>
         </w:rPr>
-        <w:t>“</w:t>
-      </w:r>
-      <w:proofErr w:type="spellStart"/>
-      <w:r>
-        <w:rPr>
-          <w:rFonts w:ascii="Segoe UI Light" w:hAnsi="Segoe UI Light" w:cs="Segoe UI Light"/>
-          <w:i/>
-          <w:iCs/>
-          <w:sz w:val="20"/>
-          <w:szCs w:val="20"/>
-        </w:rPr>
-        <w:t>estado_final</w:t>
-      </w:r>
-      <w:proofErr w:type="spellEnd"/>
-      <w:r>
-        <w:rPr>
-          <w:rFonts w:ascii="Segoe UI Light" w:hAnsi="Segoe UI Light" w:cs="Segoe UI Light"/>
-          <w:i/>
-          <w:iCs/>
-          <w:sz w:val="20"/>
-          <w:szCs w:val="20"/>
-        </w:rPr>
-        <w:t xml:space="preserve">” </w:t>
+        <w:t xml:space="preserve">“estado_final” </w:t>
       </w:r>
       <w:r>
         <w:rPr>
@@ -5332,9 +5477,16 @@
           <w:sz w:val="20"/>
           <w:szCs w:val="20"/>
         </w:rPr>
-        <w:t>“</w:t>
-      </w:r>
-      <w:proofErr w:type="spellStart"/>
+        <w:t xml:space="preserve">“valida_establecimiento_nombre_oficial” </w:t>
+      </w:r>
+      <w:r>
+        <w:rPr>
+          <w:rFonts w:ascii="Segoe UI Light" w:hAnsi="Segoe UI Light" w:cs="Segoe UI Light"/>
+          <w:sz w:val="20"/>
+          <w:szCs w:val="20"/>
+        </w:rPr>
+        <w:t xml:space="preserve">y </w:t>
+      </w:r>
       <w:r>
         <w:rPr>
           <w:rFonts w:ascii="Segoe UI Light" w:hAnsi="Segoe UI Light" w:cs="Segoe UI Light"/>
@@ -5343,9 +5495,16 @@
           <w:sz w:val="20"/>
           <w:szCs w:val="20"/>
         </w:rPr>
-        <w:t>valida_establecimiento_nombre_oficial</w:t>
-      </w:r>
-      <w:proofErr w:type="spellEnd"/>
+        <w:t xml:space="preserve">“valida_establecimiento_nombre_alias” </w:t>
+      </w:r>
+      <w:r>
+        <w:rPr>
+          <w:rFonts w:ascii="Segoe UI Light" w:hAnsi="Segoe UI Light" w:cs="Segoe UI Light"/>
+          <w:sz w:val="20"/>
+          <w:szCs w:val="20"/>
+        </w:rPr>
+        <w:t>se validarán de manera conjunta</w:t>
+      </w:r>
       <w:r>
         <w:rPr>
           <w:rFonts w:ascii="Segoe UI Light" w:hAnsi="Segoe UI Light" w:cs="Segoe UI Light"/>
@@ -5354,15 +5513,15 @@
           <w:sz w:val="20"/>
           <w:szCs w:val="20"/>
         </w:rPr>
-        <w:t xml:space="preserve">” </w:t>
-      </w:r>
-      <w:r>
-        <w:rPr>
-          <w:rFonts w:ascii="Segoe UI Light" w:hAnsi="Segoe UI Light" w:cs="Segoe UI Light"/>
-          <w:sz w:val="20"/>
-          <w:szCs w:val="20"/>
-        </w:rPr>
-        <w:t xml:space="preserve">y </w:t>
+        <w:t>,</w:t>
+      </w:r>
+      <w:r>
+        <w:rPr>
+          <w:rFonts w:ascii="Segoe UI Light" w:hAnsi="Segoe UI Light" w:cs="Segoe UI Light"/>
+          <w:sz w:val="20"/>
+          <w:szCs w:val="20"/>
+        </w:rPr>
+        <w:t xml:space="preserve"> el resultado será </w:t>
       </w:r>
       <w:r>
         <w:rPr>
@@ -5372,9 +5531,16 @@
           <w:sz w:val="20"/>
           <w:szCs w:val="20"/>
         </w:rPr>
-        <w:t>“</w:t>
-      </w:r>
-      <w:proofErr w:type="spellStart"/>
+        <w:t>“OK”</w:t>
+      </w:r>
+      <w:r>
+        <w:rPr>
+          <w:rFonts w:ascii="Segoe UI Light" w:hAnsi="Segoe UI Light" w:cs="Segoe UI Light"/>
+          <w:sz w:val="20"/>
+          <w:szCs w:val="20"/>
+        </w:rPr>
+        <w:t xml:space="preserve"> si al menos una de ellas posee el estado </w:t>
+      </w:r>
       <w:r>
         <w:rPr>
           <w:rFonts w:ascii="Segoe UI Light" w:hAnsi="Segoe UI Light" w:cs="Segoe UI Light"/>
@@ -5383,71 +5549,6 @@
           <w:sz w:val="20"/>
           <w:szCs w:val="20"/>
         </w:rPr>
-        <w:t>valida_establecimiento_nombre_alias</w:t>
-      </w:r>
-      <w:proofErr w:type="spellEnd"/>
-      <w:r>
-        <w:rPr>
-          <w:rFonts w:ascii="Segoe UI Light" w:hAnsi="Segoe UI Light" w:cs="Segoe UI Light"/>
-          <w:i/>
-          <w:iCs/>
-          <w:sz w:val="20"/>
-          <w:szCs w:val="20"/>
-        </w:rPr>
-        <w:t xml:space="preserve">” </w:t>
-      </w:r>
-      <w:r>
-        <w:rPr>
-          <w:rFonts w:ascii="Segoe UI Light" w:hAnsi="Segoe UI Light" w:cs="Segoe UI Light"/>
-          <w:sz w:val="20"/>
-          <w:szCs w:val="20"/>
-        </w:rPr>
-        <w:t>se validarán de manera conjunta</w:t>
-      </w:r>
-      <w:r>
-        <w:rPr>
-          <w:rFonts w:ascii="Segoe UI Light" w:hAnsi="Segoe UI Light" w:cs="Segoe UI Light"/>
-          <w:i/>
-          <w:iCs/>
-          <w:sz w:val="20"/>
-          <w:szCs w:val="20"/>
-        </w:rPr>
-        <w:t>,</w:t>
-      </w:r>
-      <w:r>
-        <w:rPr>
-          <w:rFonts w:ascii="Segoe UI Light" w:hAnsi="Segoe UI Light" w:cs="Segoe UI Light"/>
-          <w:sz w:val="20"/>
-          <w:szCs w:val="20"/>
-        </w:rPr>
-        <w:t xml:space="preserve"> el resultado será </w:t>
-      </w:r>
-      <w:r>
-        <w:rPr>
-          <w:rFonts w:ascii="Segoe UI Light" w:hAnsi="Segoe UI Light" w:cs="Segoe UI Light"/>
-          <w:i/>
-          <w:iCs/>
-          <w:sz w:val="20"/>
-          <w:szCs w:val="20"/>
-        </w:rPr>
-        <w:t>“OK”</w:t>
-      </w:r>
-      <w:r>
-        <w:rPr>
-          <w:rFonts w:ascii="Segoe UI Light" w:hAnsi="Segoe UI Light" w:cs="Segoe UI Light"/>
-          <w:sz w:val="20"/>
-          <w:szCs w:val="20"/>
-        </w:rPr>
-        <w:t xml:space="preserve"> si al menos una de ellas posee el estado </w:t>
-      </w:r>
-      <w:r>
-        <w:rPr>
-          <w:rFonts w:ascii="Segoe UI Light" w:hAnsi="Segoe UI Light" w:cs="Segoe UI Light"/>
-          <w:i/>
-          <w:iCs/>
-          <w:sz w:val="20"/>
-          <w:szCs w:val="20"/>
-        </w:rPr>
         <w:t>“OK”.</w:t>
       </w:r>
     </w:p>
@@ -5467,7 +5568,7 @@
           <w:vertAlign w:val="superscript"/>
         </w:rPr>
       </w:pPr>
-      <w:bookmarkStart w:id="14" w:name="_Hlk209431313"/>
+      <w:bookmarkStart w:id="23" w:name="_Hlk209431313"/>
       <w:r>
         <w:rPr>
           <w:noProof/>
@@ -5568,7 +5669,7 @@
         </w:rPr>
         <w:t>ortadas.</w:t>
       </w:r>
-      <w:bookmarkEnd w:id="14"/>
+      <w:bookmarkEnd w:id="23"/>
     </w:p>
     <w:p>
       <w:pPr>
@@ -6065,7 +6166,7 @@
         </w:rPr>
         <w:t xml:space="preserve"> En esta hoja de reporte se identifican todas las modificaciones detectadas en los valores entre </w:t>
       </w:r>
-      <w:del w:id="15" w:author="Karina Stapfer Jara" w:date="2025-11-11T14:44:00Z" w16du:dateUtc="2025-11-11T17:44:00Z">
+      <w:del w:id="24" w:author="Karina Stapfer Jara" w:date="2025-11-11T14:44:00Z" w16du:dateUtc="2025-11-11T17:44:00Z">
         <w:r>
           <w:rPr>
             <w:rFonts w:ascii="Segoe UI Light" w:hAnsi="Segoe UI Light" w:cs="Segoe UI Light"/>
@@ -6075,7 +6176,7 @@
           <w:delText>los archivos emparejados</w:delText>
         </w:r>
       </w:del>
-      <w:ins w:id="16" w:author="Karina Stapfer Jara" w:date="2025-11-11T14:44:00Z" w16du:dateUtc="2025-11-11T17:44:00Z">
+      <w:ins w:id="25" w:author="Karina Stapfer Jara" w:date="2025-11-11T14:44:00Z" w16du:dateUtc="2025-11-11T17:44:00Z">
         <w:r>
           <w:rPr>
             <w:rFonts w:ascii="Segoe UI Light" w:hAnsi="Segoe UI Light" w:cs="Segoe UI Light"/>
@@ -6085,7 +6186,7 @@
           <w:t>dos archivos,</w:t>
         </w:r>
       </w:ins>
-      <w:ins w:id="17" w:author="Karina Stapfer Jara" w:date="2025-11-11T14:45:00Z" w16du:dateUtc="2025-11-11T17:45:00Z">
+      <w:ins w:id="26" w:author="Karina Stapfer Jara" w:date="2025-11-11T14:45:00Z" w16du:dateUtc="2025-11-11T17:45:00Z">
         <w:r>
           <w:rPr>
             <w:rFonts w:ascii="Segoe UI Light" w:hAnsi="Segoe UI Light" w:cs="Segoe UI Light"/>
@@ -6095,7 +6196,7 @@
           <w:t xml:space="preserve"> es decir al comparar dos archivos de un </w:t>
         </w:r>
       </w:ins>
-      <w:ins w:id="18" w:author="Karina Stapfer Jara" w:date="2025-11-11T14:44:00Z" w16du:dateUtc="2025-11-11T17:44:00Z">
+      <w:ins w:id="27" w:author="Karina Stapfer Jara" w:date="2025-11-11T14:44:00Z" w16du:dateUtc="2025-11-11T17:44:00Z">
         <w:r>
           <w:rPr>
             <w:rFonts w:ascii="Segoe UI Light" w:hAnsi="Segoe UI Light" w:cs="Segoe UI Light"/>
@@ -6289,24 +6390,34 @@
     </w:p>
     <w:p>
       <w:pPr>
+        <w:pStyle w:val="Titulo"/>
+        <w:rPr>
+          <w:b w:val="0"/>
+          <w:bCs w:val="0"/>
+        </w:rPr>
+      </w:pPr>
+      <w:bookmarkStart w:id="28" w:name="_Toc234404047"/>
+      <w:r>
+        <w:rPr>
+          <w:b w:val="0"/>
+          <w:bCs w:val="0"/>
+        </w:rPr>
+        <w:lastRenderedPageBreak/>
+        <w:t>ESTRUCTURA REPORTE ERRORES-CONSISTENCIAS-REM.XLSX:</w:t>
+      </w:r>
+      <w:bookmarkEnd w:id="28"/>
+    </w:p>
+    <w:p>
+      <w:pPr>
         <w:jc w:val="both"/>
         <w:rPr>
-          <w:rFonts w:ascii="Segoe UI Light" w:hAnsi="Segoe UI Light" w:cs="Segoe UI Light"/>
-          <w:sz w:val="20"/>
-          <w:szCs w:val="20"/>
-          <w:u w:val="single"/>
-        </w:rPr>
-      </w:pPr>
-      <w:r>
-        <w:rPr>
-          <w:rFonts w:ascii="Segoe UI Light" w:hAnsi="Segoe UI Light" w:cs="Segoe UI Light"/>
-          <w:sz w:val="20"/>
-          <w:szCs w:val="20"/>
-          <w:u w:val="single"/>
-        </w:rPr>
-        <w:lastRenderedPageBreak/>
-        <w:t>Estructura reporte Errores-Consistencias-REM.xlsx:</w:t>
-      </w:r>
+          <w:rFonts w:ascii="Segoe UI Light" w:hAnsi="Segoe UI Light"/>
+          <w:caps/>
+          <w:spacing w:val="20"/>
+          <w:sz w:val="20"/>
+          <w:szCs w:val="18"/>
+        </w:rPr>
+      </w:pPr>
     </w:p>
     <w:p>
       <w:pPr>
@@ -7034,7 +7145,7 @@
       <w:pPr>
         <w:spacing w:line="21" w:lineRule="atLeast"/>
         <w:rPr>
-          <w:ins w:id="19" w:author="Karina Stapfer Jara" w:date="2025-11-11T14:46:00Z" w16du:dateUtc="2025-11-11T17:46:00Z"/>
+          <w:ins w:id="29" w:author="Karina Stapfer Jara" w:date="2025-11-11T14:46:00Z" w16du:dateUtc="2025-11-11T17:46:00Z"/>
           <w:b/>
           <w:bCs/>
           <w:sz w:val="20"/>
@@ -7044,60 +7155,28 @@
     </w:p>
     <w:p>
       <w:pPr>
-        <w:spacing w:after="160" w:line="278" w:lineRule="auto"/>
-        <w:jc w:val="both"/>
-        <w:rPr>
-          <w:rFonts w:ascii="Segoe UI Light" w:hAnsi="Segoe UI Light" w:cs="Segoe UI Light"/>
-          <w:b/>
-          <w:bCs/>
-          <w:sz w:val="20"/>
-          <w:szCs w:val="20"/>
-        </w:rPr>
-      </w:pPr>
-      <w:bookmarkStart w:id="20" w:name="_Toc213764895"/>
-      <w:ins w:id="21" w:author="Karina Stapfer Jara" w:date="2025-11-11T14:46:00Z" w16du:dateUtc="2025-11-11T17:46:00Z">
+        <w:pStyle w:val="Titulo"/>
+      </w:pPr>
+      <w:bookmarkStart w:id="30" w:name="_Toc213764895"/>
+      <w:bookmarkStart w:id="31" w:name="_Toc234403686"/>
+      <w:bookmarkStart w:id="32" w:name="_Toc234404048"/>
+      <w:ins w:id="33" w:author="Karina Stapfer Jara" w:date="2025-11-11T14:46:00Z" w16du:dateUtc="2025-11-11T17:46:00Z">
         <w:r>
-          <w:rPr>
-            <w:rFonts w:ascii="Segoe UI Light" w:hAnsi="Segoe UI Light" w:cs="Segoe UI Light"/>
-            <w:b/>
-            <w:bCs/>
-            <w:sz w:val="20"/>
-            <w:szCs w:val="20"/>
-          </w:rPr>
           <w:t>EJECUCIÓN DEL APLICATIVO DE VALIDA</w:t>
         </w:r>
       </w:ins>
       <w:r>
-        <w:rPr>
-          <w:rFonts w:ascii="Segoe UI Light" w:hAnsi="Segoe UI Light" w:cs="Segoe UI Light"/>
-          <w:b/>
-          <w:bCs/>
-          <w:sz w:val="20"/>
-          <w:szCs w:val="20"/>
-        </w:rPr>
         <w:t>DOR CONSISTENCIAS</w:t>
       </w:r>
-      <w:ins w:id="22" w:author="Karina Stapfer Jara" w:date="2025-11-11T14:46:00Z" w16du:dateUtc="2025-11-11T17:46:00Z">
+      <w:ins w:id="34" w:author="Karina Stapfer Jara" w:date="2025-11-11T14:46:00Z" w16du:dateUtc="2025-11-11T17:46:00Z">
         <w:r>
-          <w:rPr>
-            <w:rFonts w:ascii="Segoe UI Light" w:hAnsi="Segoe UI Light" w:cs="Segoe UI Light"/>
-            <w:b/>
-            <w:bCs/>
-            <w:sz w:val="20"/>
-            <w:szCs w:val="20"/>
-          </w:rPr>
           <w:t xml:space="preserve"> REM: Directorios y archivos de salida de configuración.</w:t>
         </w:r>
       </w:ins>
-      <w:bookmarkEnd w:id="20"/>
-      <w:r>
-        <w:rPr>
-          <w:rFonts w:ascii="Segoe UI Light" w:hAnsi="Segoe UI Light" w:cs="Segoe UI Light"/>
-          <w:b/>
-          <w:bCs/>
-          <w:sz w:val="20"/>
-          <w:szCs w:val="20"/>
-        </w:rPr>
+      <w:bookmarkEnd w:id="30"/>
+      <w:bookmarkEnd w:id="31"/>
+      <w:bookmarkEnd w:id="32"/>
+      <w:r>
         <w:t xml:space="preserve"> </w:t>
       </w:r>
     </w:p>
@@ -7313,7 +7392,7 @@
         </w:rPr>
         <w:t>, si es que no existe previamente. En este directorio se depositan, por cada ejecución</w:t>
       </w:r>
-      <w:ins w:id="23" w:author="Karina Stapfer Jara" w:date="2025-11-11T14:47:00Z" w16du:dateUtc="2025-11-11T17:47:00Z">
+      <w:ins w:id="35" w:author="Karina Stapfer Jara" w:date="2025-11-11T14:47:00Z" w16du:dateUtc="2025-11-11T17:47:00Z">
         <w:r>
           <w:rPr>
             <w:rFonts w:ascii="Segoe UI Light" w:hAnsi="Segoe UI Light" w:cs="Segoe UI Light"/>
@@ -11700,6 +11779,85 @@
       <w:szCs w:val="24"/>
     </w:rPr>
   </w:style>
+  <w:style w:type="paragraph" w:customStyle="1" w:styleId="Subtitulo1">
+    <w:name w:val="Subtitulo 1"/>
+    <w:basedOn w:val="Subttulo"/>
+    <w:next w:val="Subttulo"/>
+    <w:link w:val="Subtitulo1Car"/>
+    <w:qFormat/>
+    <w:rsid w:val="0042794D"/>
+    <w:pPr>
+      <w:jc w:val="left"/>
+    </w:pPr>
+    <w:rPr>
+      <w:rFonts w:ascii="Segoe UI Light" w:hAnsi="Segoe UI Light"/>
+      <w:sz w:val="20"/>
+    </w:rPr>
+  </w:style>
+  <w:style w:type="character" w:customStyle="1" w:styleId="Subtitulo1Car">
+    <w:name w:val="Subtitulo 1 Car"/>
+    <w:basedOn w:val="SubttuloCar"/>
+    <w:link w:val="Subtitulo1"/>
+    <w:rsid w:val="0042794D"/>
+    <w:rPr>
+      <w:rFonts w:ascii="Segoe UI Light" w:eastAsiaTheme="majorEastAsia" w:hAnsi="Segoe UI Light" w:cstheme="majorBidi"/>
+      <w:caps/>
+      <w:spacing w:val="20"/>
+      <w:sz w:val="20"/>
+      <w:szCs w:val="18"/>
+      <w:lang w:val="es-ES"/>
+    </w:rPr>
+  </w:style>
+  <w:style w:type="paragraph" w:styleId="TDC3">
+    <w:name w:val="toc 3"/>
+    <w:basedOn w:val="Normal"/>
+    <w:next w:val="Normal"/>
+    <w:autoRedefine/>
+    <w:uiPriority w:val="39"/>
+    <w:unhideWhenUsed/>
+    <w:rsid w:val="0089445B"/>
+    <w:pPr>
+      <w:spacing w:after="100" w:line="259" w:lineRule="auto"/>
+      <w:ind w:left="440"/>
+    </w:pPr>
+    <w:rPr>
+      <w:rFonts w:asciiTheme="minorHAnsi" w:eastAsiaTheme="minorEastAsia" w:hAnsiTheme="minorHAnsi" w:cs="Times New Roman"/>
+      <w:lang w:val="es-CL" w:eastAsia="es-CL" w:bidi="ar-SA"/>
+    </w:rPr>
+  </w:style>
+  <w:style w:type="paragraph" w:customStyle="1" w:styleId="Titulo">
+    <w:name w:val="Titulo"/>
+    <w:basedOn w:val="Normal"/>
+    <w:link w:val="TituloCar"/>
+    <w:qFormat/>
+    <w:rsid w:val="0089445B"/>
+    <w:pPr>
+      <w:spacing w:line="276" w:lineRule="auto"/>
+      <w:jc w:val="both"/>
+      <w:outlineLvl w:val="0"/>
+    </w:pPr>
+    <w:rPr>
+      <w:rFonts w:ascii="Segoe UI Light" w:hAnsi="Segoe UI Light"/>
+      <w:b/>
+      <w:bCs/>
+      <w:color w:val="000000" w:themeColor="text1"/>
+      <w:szCs w:val="28"/>
+    </w:rPr>
+  </w:style>
+  <w:style w:type="character" w:customStyle="1" w:styleId="TituloCar">
+    <w:name w:val="Titulo Car"/>
+    <w:basedOn w:val="Fuentedeprrafopredeter"/>
+    <w:link w:val="Titulo"/>
+    <w:rsid w:val="0089445B"/>
+    <w:rPr>
+      <w:rFonts w:ascii="Segoe UI Light" w:hAnsi="Segoe UI Light"/>
+      <w:b/>
+      <w:bCs/>
+      <w:color w:val="000000" w:themeColor="text1"/>
+      <w:szCs w:val="28"/>
+      <w:lang w:val="es-ES"/>
+    </w:rPr>
+  </w:style>
 </w:styles>
 </file>
 
@@ -11827,6 +11985,7 @@
     <w:rsid w:val="0015372A"/>
     <w:rsid w:val="00174893"/>
     <w:rsid w:val="001B49CB"/>
+    <w:rsid w:val="001E19B4"/>
     <w:rsid w:val="002049F8"/>
     <w:rsid w:val="0021350A"/>
     <w:rsid w:val="002510A8"/>
@@ -11834,6 +11993,7 @@
     <w:rsid w:val="0026684D"/>
     <w:rsid w:val="002720A7"/>
     <w:rsid w:val="002A0584"/>
+    <w:rsid w:val="002D526F"/>
     <w:rsid w:val="002F7048"/>
     <w:rsid w:val="00316245"/>
     <w:rsid w:val="00344A1A"/>
@@ -11908,12 +12068,14 @@
     <w:rsid w:val="00D91BAF"/>
     <w:rsid w:val="00E279A7"/>
     <w:rsid w:val="00E5296F"/>
+    <w:rsid w:val="00E9629E"/>
     <w:rsid w:val="00EB6612"/>
     <w:rsid w:val="00EE1FC4"/>
     <w:rsid w:val="00F57281"/>
     <w:rsid w:val="00FA28CC"/>
     <w:rsid w:val="00FC3CC2"/>
     <w:rsid w:val="00FD12BB"/>
+    <w:rsid w:val="00FF053C"/>
   </w:rsids>
   <m:mathPr>
     <m:mathFont m:val="Cambria Math"/>

</xml_diff>

<commit_message>
Se agrega  manual-aplicativo-ust-acumulado-ver-1.0.docx - Se agrega Preparación del aplicativo a manual-aplicativo-validador-consistencias-rem-ver-3.0.docx
</commit_message>
<xml_diff>
--- a/manual-aplicativo-validador-consistencias-rem-ver-3.0.docx
+++ b/manual-aplicativo-validador-consistencias-rem-ver-3.0.docx
@@ -1525,7 +1525,7 @@
               <w:r>
                 <w:fldChar w:fldCharType="separate"/>
               </w:r>
-              <w:hyperlink w:anchor="_Toc234404038" w:history="1">
+              <w:hyperlink w:anchor="_Toc234422418" w:history="1">
                 <w:r>
                   <w:rPr>
                     <w:rStyle w:val="Hipervnculo"/>
@@ -1553,7 +1553,7 @@
                     <w:noProof/>
                     <w:webHidden/>
                   </w:rPr>
-                  <w:instrText xml:space="preserve"> PAGEREF _Toc234404038 \h </w:instrText>
+                  <w:instrText xml:space="preserve"> PAGEREF _Toc234422418 \h </w:instrText>
                 </w:r>
                 <w:r>
                   <w:rPr>
@@ -1600,7 +1600,7 @@
                   <w14:ligatures w14:val="standardContextual"/>
                 </w:rPr>
               </w:pPr>
-              <w:hyperlink w:anchor="_Toc234404039" w:history="1">
+              <w:hyperlink w:anchor="_Toc234422419" w:history="1">
                 <w:r>
                   <w:rPr>
                     <w:rStyle w:val="Hipervnculo"/>
@@ -1628,7 +1628,7 @@
                     <w:noProof/>
                     <w:webHidden/>
                   </w:rPr>
-                  <w:instrText xml:space="preserve"> PAGEREF _Toc234404039 \h </w:instrText>
+                  <w:instrText xml:space="preserve"> PAGEREF _Toc234422419 \h </w:instrText>
                 </w:r>
                 <w:r>
                   <w:rPr>
@@ -1675,7 +1675,7 @@
                   <w14:ligatures w14:val="standardContextual"/>
                 </w:rPr>
               </w:pPr>
-              <w:hyperlink w:anchor="_Toc234404040" w:history="1">
+              <w:hyperlink w:anchor="_Toc234422420" w:history="1">
                 <w:r>
                   <w:rPr>
                     <w:rStyle w:val="Hipervnculo"/>
@@ -1702,7 +1702,7 @@
                     <w:noProof/>
                     <w:webHidden/>
                   </w:rPr>
-                  <w:instrText xml:space="preserve"> PAGEREF _Toc234404040 \h </w:instrText>
+                  <w:instrText xml:space="preserve"> PAGEREF _Toc234422420 \h </w:instrText>
                 </w:r>
                 <w:r>
                   <w:rPr>
@@ -1749,7 +1749,7 @@
                   <w14:ligatures w14:val="standardContextual"/>
                 </w:rPr>
               </w:pPr>
-              <w:hyperlink w:anchor="_Toc234404041" w:history="1">
+              <w:hyperlink w:anchor="_Toc234422421" w:history="1">
                 <w:r>
                   <w:rPr>
                     <w:rStyle w:val="Hipervnculo"/>
@@ -1776,7 +1776,7 @@
                     <w:noProof/>
                     <w:webHidden/>
                   </w:rPr>
-                  <w:instrText xml:space="preserve"> PAGEREF _Toc234404041 \h </w:instrText>
+                  <w:instrText xml:space="preserve"> PAGEREF _Toc234422421 \h </w:instrText>
                 </w:r>
                 <w:r>
                   <w:rPr>
@@ -1823,7 +1823,7 @@
                   <w14:ligatures w14:val="standardContextual"/>
                 </w:rPr>
               </w:pPr>
-              <w:hyperlink w:anchor="_Toc234404042" w:history="1">
+              <w:hyperlink w:anchor="_Toc234422422" w:history="1">
                 <w:r>
                   <w:rPr>
                     <w:rStyle w:val="Hipervnculo"/>
@@ -1850,7 +1850,7 @@
                     <w:noProof/>
                     <w:webHidden/>
                   </w:rPr>
-                  <w:instrText xml:space="preserve"> PAGEREF _Toc234404042 \h </w:instrText>
+                  <w:instrText xml:space="preserve"> PAGEREF _Toc234422422 \h </w:instrText>
                 </w:r>
                 <w:r>
                   <w:rPr>
@@ -1897,13 +1897,13 @@
                   <w14:ligatures w14:val="standardContextual"/>
                 </w:rPr>
               </w:pPr>
-              <w:hyperlink w:anchor="_Toc234404043" w:history="1">
+              <w:hyperlink w:anchor="_Toc234422423" w:history="1">
                 <w:r>
                   <w:rPr>
                     <w:rStyle w:val="Hipervnculo"/>
                     <w:noProof/>
                   </w:rPr>
-                  <w:t>3.REQUISITOS:</w:t>
+                  <w:t>PREPARACIÓN DEL APLICATIVO</w:t>
                 </w:r>
                 <w:r>
                   <w:rPr>
@@ -1924,7 +1924,7 @@
                     <w:noProof/>
                     <w:webHidden/>
                   </w:rPr>
-                  <w:instrText xml:space="preserve"> PAGEREF _Toc234404043 \h </w:instrText>
+                  <w:instrText xml:space="preserve"> PAGEREF _Toc234422423 \h </w:instrText>
                 </w:r>
                 <w:r>
                   <w:rPr>
@@ -1971,13 +1971,13 @@
                   <w14:ligatures w14:val="standardContextual"/>
                 </w:rPr>
               </w:pPr>
-              <w:hyperlink w:anchor="_Toc234404044" w:history="1">
+              <w:hyperlink w:anchor="_Toc234422428" w:history="1">
                 <w:r>
                   <w:rPr>
                     <w:rStyle w:val="Hipervnculo"/>
                     <w:noProof/>
                   </w:rPr>
-                  <w:t>EJECUCIÓN DEL APLICATIVO DE VALIDACIÓN REM: Inicio del Proceso</w:t>
+                  <w:t>REQUISITOS</w:t>
                 </w:r>
                 <w:r>
                   <w:rPr>
@@ -1998,7 +1998,7 @@
                     <w:noProof/>
                     <w:webHidden/>
                   </w:rPr>
-                  <w:instrText xml:space="preserve"> PAGEREF _Toc234404044 \h </w:instrText>
+                  <w:instrText xml:space="preserve"> PAGEREF _Toc234422428 \h </w:instrText>
                 </w:r>
                 <w:r>
                   <w:rPr>
@@ -2045,7 +2045,81 @@
                   <w14:ligatures w14:val="standardContextual"/>
                 </w:rPr>
               </w:pPr>
-              <w:hyperlink w:anchor="_Toc234404045" w:history="1">
+              <w:hyperlink w:anchor="_Toc234422429" w:history="1">
+                <w:r>
+                  <w:rPr>
+                    <w:rStyle w:val="Hipervnculo"/>
+                    <w:noProof/>
+                  </w:rPr>
+                  <w:t>EJECUCIÓN DEL APLICATIVO DE VALIDACIÓN REM: Inicio del Proceso</w:t>
+                </w:r>
+                <w:r>
+                  <w:rPr>
+                    <w:noProof/>
+                    <w:webHidden/>
+                  </w:rPr>
+                  <w:tab/>
+                </w:r>
+                <w:r>
+                  <w:rPr>
+                    <w:noProof/>
+                    <w:webHidden/>
+                  </w:rPr>
+                  <w:fldChar w:fldCharType="begin"/>
+                </w:r>
+                <w:r>
+                  <w:rPr>
+                    <w:noProof/>
+                    <w:webHidden/>
+                  </w:rPr>
+                  <w:instrText xml:space="preserve"> PAGEREF _Toc234422429 \h </w:instrText>
+                </w:r>
+                <w:r>
+                  <w:rPr>
+                    <w:noProof/>
+                    <w:webHidden/>
+                  </w:rPr>
+                </w:r>
+                <w:r>
+                  <w:rPr>
+                    <w:noProof/>
+                    <w:webHidden/>
+                  </w:rPr>
+                  <w:fldChar w:fldCharType="separate"/>
+                </w:r>
+                <w:r>
+                  <w:rPr>
+                    <w:noProof/>
+                    <w:webHidden/>
+                  </w:rPr>
+                  <w:t>5</w:t>
+                </w:r>
+                <w:r>
+                  <w:rPr>
+                    <w:noProof/>
+                    <w:webHidden/>
+                  </w:rPr>
+                  <w:fldChar w:fldCharType="end"/>
+                </w:r>
+              </w:hyperlink>
+            </w:p>
+            <w:p>
+              <w:pPr>
+                <w:pStyle w:val="TDC1"/>
+                <w:tabs>
+                  <w:tab w:val="right" w:leader="dot" w:pos="8828"/>
+                </w:tabs>
+                <w:rPr>
+                  <w:rFonts w:asciiTheme="minorHAnsi" w:eastAsiaTheme="minorEastAsia" w:hAnsiTheme="minorHAnsi" w:cstheme="minorBidi"/>
+                  <w:noProof/>
+                  <w:kern w:val="2"/>
+                  <w:sz w:val="24"/>
+                  <w:szCs w:val="24"/>
+                  <w:lang w:val="es-CL" w:eastAsia="es-CL" w:bidi="ar-SA"/>
+                  <w14:ligatures w14:val="standardContextual"/>
+                </w:rPr>
+              </w:pPr>
+              <w:hyperlink w:anchor="_Toc234422430" w:history="1">
                 <w:r>
                   <w:rPr>
                     <w:rStyle w:val="Hipervnculo"/>
@@ -2073,7 +2147,7 @@
                     <w:noProof/>
                     <w:webHidden/>
                   </w:rPr>
-                  <w:instrText xml:space="preserve"> PAGEREF _Toc234404045 \h </w:instrText>
+                  <w:instrText xml:space="preserve"> PAGEREF _Toc234422430 \h </w:instrText>
                 </w:r>
                 <w:r>
                   <w:rPr>
@@ -2093,7 +2167,7 @@
                     <w:noProof/>
                     <w:webHidden/>
                   </w:rPr>
-                  <w:t>6</w:t>
+                  <w:t>7</w:t>
                 </w:r>
                 <w:r>
                   <w:rPr>
@@ -2120,27 +2194,13 @@
                   <w14:ligatures w14:val="standardContextual"/>
                 </w:rPr>
               </w:pPr>
-              <w:hyperlink w:anchor="_Toc234404047" w:history="1">
+              <w:hyperlink w:anchor="_Toc234422431" w:history="1">
                 <w:r>
                   <w:rPr>
                     <w:rStyle w:val="Hipervnculo"/>
                     <w:noProof/>
                   </w:rPr>
-                  <w:t>ESTRUCTURA REPORTE ERRORES-C</w:t>
-                </w:r>
-                <w:r>
-                  <w:rPr>
-                    <w:rStyle w:val="Hipervnculo"/>
-                    <w:noProof/>
-                  </w:rPr>
-                  <w:t>O</w:t>
-                </w:r>
-                <w:r>
-                  <w:rPr>
-                    <w:rStyle w:val="Hipervnculo"/>
-                    <w:noProof/>
-                  </w:rPr>
-                  <w:t>NSISTENCIAS-REM.XLSX:</w:t>
+                  <w:t>ESTRUCTURA REPORTE RESULTADOS-VALIDACIÓN.XLSX:</w:t>
                 </w:r>
                 <w:r>
                   <w:rPr>
@@ -2161,7 +2221,7 @@
                     <w:noProof/>
                     <w:webHidden/>
                   </w:rPr>
-                  <w:instrText xml:space="preserve"> PAGEREF _Toc234404047 \h </w:instrText>
+                  <w:instrText xml:space="preserve"> PAGEREF _Toc234422431 \h </w:instrText>
                 </w:r>
                 <w:r>
                   <w:rPr>
@@ -2181,7 +2241,7 @@
                     <w:noProof/>
                     <w:webHidden/>
                   </w:rPr>
-                  <w:t>12</w:t>
+                  <w:t>8</w:t>
                 </w:r>
                 <w:r>
                   <w:rPr>
@@ -2208,7 +2268,81 @@
                   <w14:ligatures w14:val="standardContextual"/>
                 </w:rPr>
               </w:pPr>
-              <w:hyperlink w:anchor="_Toc234404048" w:history="1">
+              <w:hyperlink w:anchor="_Toc234422432" w:history="1">
+                <w:r>
+                  <w:rPr>
+                    <w:rStyle w:val="Hipervnculo"/>
+                    <w:noProof/>
+                  </w:rPr>
+                  <w:t>ESTRUCTURA REPORTE ERRORES-CONSISTENCIAS-REM.XLSX:</w:t>
+                </w:r>
+                <w:r>
+                  <w:rPr>
+                    <w:noProof/>
+                    <w:webHidden/>
+                  </w:rPr>
+                  <w:tab/>
+                </w:r>
+                <w:r>
+                  <w:rPr>
+                    <w:noProof/>
+                    <w:webHidden/>
+                  </w:rPr>
+                  <w:fldChar w:fldCharType="begin"/>
+                </w:r>
+                <w:r>
+                  <w:rPr>
+                    <w:noProof/>
+                    <w:webHidden/>
+                  </w:rPr>
+                  <w:instrText xml:space="preserve"> PAGEREF _Toc234422432 \h </w:instrText>
+                </w:r>
+                <w:r>
+                  <w:rPr>
+                    <w:noProof/>
+                    <w:webHidden/>
+                  </w:rPr>
+                </w:r>
+                <w:r>
+                  <w:rPr>
+                    <w:noProof/>
+                    <w:webHidden/>
+                  </w:rPr>
+                  <w:fldChar w:fldCharType="separate"/>
+                </w:r>
+                <w:r>
+                  <w:rPr>
+                    <w:noProof/>
+                    <w:webHidden/>
+                  </w:rPr>
+                  <w:t>13</w:t>
+                </w:r>
+                <w:r>
+                  <w:rPr>
+                    <w:noProof/>
+                    <w:webHidden/>
+                  </w:rPr>
+                  <w:fldChar w:fldCharType="end"/>
+                </w:r>
+              </w:hyperlink>
+            </w:p>
+            <w:p>
+              <w:pPr>
+                <w:pStyle w:val="TDC1"/>
+                <w:tabs>
+                  <w:tab w:val="right" w:leader="dot" w:pos="8828"/>
+                </w:tabs>
+                <w:rPr>
+                  <w:rFonts w:asciiTheme="minorHAnsi" w:eastAsiaTheme="minorEastAsia" w:hAnsiTheme="minorHAnsi" w:cstheme="minorBidi"/>
+                  <w:noProof/>
+                  <w:kern w:val="2"/>
+                  <w:sz w:val="24"/>
+                  <w:szCs w:val="24"/>
+                  <w:lang w:val="es-CL" w:eastAsia="es-CL" w:bidi="ar-SA"/>
+                  <w14:ligatures w14:val="standardContextual"/>
+                </w:rPr>
+              </w:pPr>
+              <w:hyperlink w:anchor="_Toc234422433" w:history="1">
                 <w:r>
                   <w:rPr>
                     <w:rStyle w:val="Hipervnculo"/>
@@ -2235,7 +2369,7 @@
                     <w:noProof/>
                     <w:webHidden/>
                   </w:rPr>
-                  <w:instrText xml:space="preserve"> PAGEREF _Toc234404048 \h </w:instrText>
+                  <w:instrText xml:space="preserve"> PAGEREF _Toc234422433 \h </w:instrText>
                 </w:r>
                 <w:r>
                   <w:rPr>
@@ -2255,7 +2389,7 @@
                     <w:noProof/>
                     <w:webHidden/>
                   </w:rPr>
-                  <w:t>13</w:t>
+                  <w:t>14</w:t>
                 </w:r>
                 <w:r>
                   <w:rPr>
@@ -2390,17 +2524,6 @@
     </w:p>
     <w:p>
       <w:pPr>
-        <w:rPr>
-          <w:rFonts w:ascii="Segoe UI Light" w:hAnsi="Segoe UI Light" w:cs="Segoe UI Light"/>
-          <w:caps/>
-          <w:color w:val="000000" w:themeColor="text1"/>
-          <w:sz w:val="18"/>
-          <w:szCs w:val="18"/>
-        </w:rPr>
-      </w:pPr>
-    </w:p>
-    <w:p>
-      <w:pPr>
         <w:pStyle w:val="Titulo"/>
         <w:rPr>
           <w:del w:id="0" w:author="Karina Stapfer Jara" w:date="2025-11-11T14:48:00Z" w16du:dateUtc="2025-11-11T17:48:00Z"/>
@@ -2419,7 +2542,7 @@
       <w:bookmarkStart w:id="1" w:name="_Toc234403681"/>
       <w:bookmarkStart w:id="2" w:name="_Toc201653894"/>
       <w:bookmarkStart w:id="3" w:name="_Toc213764890"/>
-      <w:bookmarkStart w:id="4" w:name="_Toc234404038"/>
+      <w:bookmarkStart w:id="4" w:name="_Toc234422418"/>
       <w:r>
         <w:rPr>
           <w:rFonts w:cs="Segoe UI Light"/>
@@ -2447,7 +2570,6 @@
           <w:sz w:val="20"/>
           <w:szCs w:val="20"/>
         </w:rPr>
-        <w:lastRenderedPageBreak/>
         <w:t xml:space="preserve">El aplicativo de validación de registro estadístico mensual </w:t>
       </w:r>
       <w:r>
@@ -2488,7 +2610,7 @@
         </w:rPr>
       </w:pPr>
       <w:bookmarkStart w:id="5" w:name="_Toc234403682"/>
-      <w:bookmarkStart w:id="6" w:name="_Toc234404039"/>
+      <w:bookmarkStart w:id="6" w:name="_Toc234422419"/>
       <w:r>
         <w:rPr>
           <w:rFonts w:cs="Segoe UI Light"/>
@@ -2571,7 +2693,7 @@
       </w:pPr>
       <w:bookmarkStart w:id="7" w:name="_Toc213764892"/>
       <w:bookmarkStart w:id="8" w:name="_Toc234403683"/>
-      <w:bookmarkStart w:id="9" w:name="_Toc234404040"/>
+      <w:bookmarkStart w:id="9" w:name="_Toc234422420"/>
       <w:r>
         <w:t>DESCRIPCIÓN DEL APLICATIVO DE VALIDACIÓN REM</w:t>
       </w:r>
@@ -2589,7 +2711,7 @@
           <w:u w:val="single"/>
         </w:rPr>
       </w:pPr>
-      <w:bookmarkStart w:id="10" w:name="_Toc234404041"/>
+      <w:bookmarkStart w:id="10" w:name="_Toc234422421"/>
       <w:r>
         <w:rPr>
           <w:b w:val="0"/>
@@ -2774,7 +2896,7 @@
           <w:u w:val="single"/>
         </w:rPr>
       </w:pPr>
-      <w:bookmarkStart w:id="11" w:name="_Toc234404042"/>
+      <w:bookmarkStart w:id="11" w:name="_Toc234422422"/>
       <w:r>
         <w:rPr>
           <w:b w:val="0"/>
@@ -2903,6 +3025,7 @@
           <w:sz w:val="20"/>
           <w:szCs w:val="20"/>
         </w:rPr>
+        <w:lastRenderedPageBreak/>
         <w:t>El archivo de establecimientos oficiales de la red de salud según documento oficial en DEIS.</w:t>
       </w:r>
     </w:p>
@@ -2926,7 +3049,6 @@
           <w:sz w:val="20"/>
           <w:szCs w:val="20"/>
         </w:rPr>
-        <w:lastRenderedPageBreak/>
         <w:t>Un consolidado de nombres “no oficiales” usados por cada establecimiento y la hoja “</w:t>
       </w:r>
       <w:r>
@@ -2996,13 +3118,18 @@
     </w:p>
     <w:p>
       <w:pPr>
-        <w:spacing w:after="160" w:line="278" w:lineRule="auto"/>
-        <w:rPr>
-          <w:rFonts w:ascii="Segoe UI Light" w:hAnsi="Segoe UI Light" w:cs="Segoe UI Light"/>
-          <w:sz w:val="20"/>
-          <w:szCs w:val="20"/>
-        </w:rPr>
-      </w:pPr>
+        <w:pStyle w:val="Titulo"/>
+      </w:pPr>
+    </w:p>
+    <w:p>
+      <w:pPr>
+        <w:pStyle w:val="Titulo"/>
+      </w:pPr>
+      <w:bookmarkStart w:id="12" w:name="_Toc234422423"/>
+      <w:r>
+        <w:t>PREPARACIÓN DEL APLICATIVO</w:t>
+      </w:r>
+      <w:bookmarkEnd w:id="12"/>
     </w:p>
     <w:p>
       <w:pPr>
@@ -3010,62 +3137,50 @@
         <w:rPr>
           <w:b w:val="0"/>
           <w:bCs w:val="0"/>
-        </w:rPr>
-      </w:pPr>
-      <w:bookmarkStart w:id="12" w:name="_Toc234404043"/>
+          <w:sz w:val="20"/>
+          <w:szCs w:val="20"/>
+        </w:rPr>
+      </w:pPr>
+      <w:bookmarkStart w:id="13" w:name="_Toc234422424"/>
       <w:r>
         <w:rPr>
           <w:b w:val="0"/>
           <w:bCs w:val="0"/>
-        </w:rPr>
-        <w:t>3.</w:t>
-      </w:r>
-      <w:r>
+          <w:sz w:val="20"/>
+          <w:szCs w:val="20"/>
+        </w:rPr>
+        <w:t>Antes de ejecutar el aplicativo por primera vez, es necesario preparar el directorio de trabajo.</w:t>
+      </w:r>
+      <w:bookmarkEnd w:id="13"/>
+    </w:p>
+    <w:p>
+      <w:pPr>
+        <w:pStyle w:val="Titulo"/>
+        <w:numPr>
+          <w:ilvl w:val="0"/>
+          <w:numId w:val="20"/>
+        </w:numPr>
         <w:rPr>
           <w:b w:val="0"/>
           <w:bCs w:val="0"/>
-        </w:rPr>
-        <w:t>REQUISITOS:</w:t>
-      </w:r>
-      <w:bookmarkEnd w:id="12"/>
-    </w:p>
-    <w:p>
-      <w:pPr>
-        <w:rPr>
-          <w:rFonts w:ascii="Segoe UI Light" w:hAnsi="Segoe UI Light" w:cs="Segoe UI Light"/>
-          <w:sz w:val="20"/>
-          <w:szCs w:val="20"/>
-        </w:rPr>
-      </w:pPr>
-      <w:r>
-        <w:rPr>
-          <w:rFonts w:ascii="Segoe UI Light" w:hAnsi="Segoe UI Light" w:cs="Segoe UI Light"/>
-          <w:sz w:val="20"/>
-          <w:szCs w:val="20"/>
-        </w:rPr>
-        <w:t>Para ejecutar el aplicativo, es necesario contar con un directorio principal</w:t>
-      </w:r>
-      <w:r>
-        <w:rPr>
-          <w:rFonts w:ascii="Segoe UI Light" w:hAnsi="Segoe UI Light" w:cs="Segoe UI Light"/>
-          <w:b/>
-          <w:bCs/>
-          <w:sz w:val="20"/>
-          <w:szCs w:val="20"/>
-        </w:rPr>
-        <w:t xml:space="preserve"> </w:t>
-      </w:r>
-      <w:r>
-        <w:rPr>
-          <w:rFonts w:ascii="Segoe UI Light" w:hAnsi="Segoe UI Light" w:cs="Segoe UI Light"/>
-          <w:sz w:val="20"/>
-          <w:szCs w:val="20"/>
-        </w:rPr>
-        <w:t xml:space="preserve">el cual puede ser nombrado libremente por el usuario, por ejemplo: </w:t>
-      </w:r>
-      <w:r>
-        <w:rPr>
-          <w:rFonts w:ascii="Segoe UI Light" w:hAnsi="Segoe UI Light" w:cs="Segoe UI Light"/>
+          <w:sz w:val="20"/>
+          <w:szCs w:val="20"/>
+        </w:rPr>
+      </w:pPr>
+      <w:bookmarkStart w:id="14" w:name="_Toc234422425"/>
+      <w:r>
+        <w:rPr>
+          <w:b w:val="0"/>
+          <w:bCs w:val="0"/>
+          <w:sz w:val="20"/>
+          <w:szCs w:val="20"/>
+        </w:rPr>
+        <w:t xml:space="preserve">Obtener el archivo comprimido </w:t>
+      </w:r>
+      <w:r>
+        <w:rPr>
+          <w:b w:val="0"/>
+          <w:bCs w:val="0"/>
           <w:i/>
           <w:iCs/>
           <w:sz w:val="20"/>
@@ -3075,424 +3190,204 @@
       </w:r>
       <w:r>
         <w:rPr>
-          <w:rFonts w:ascii="Segoe UI Light" w:hAnsi="Segoe UI Light" w:cs="Segoe UI Light"/>
+          <w:b w:val="0"/>
+          <w:bCs w:val="0"/>
           <w:i/>
           <w:iCs/>
           <w:sz w:val="20"/>
           <w:szCs w:val="20"/>
         </w:rPr>
-        <w:t>validador-consistencias-rem</w:t>
-      </w:r>
-      <w:r>
-        <w:rPr>
-          <w:rFonts w:ascii="Segoe UI Light" w:hAnsi="Segoe UI Light" w:cs="Segoe UI Light"/>
+        <w:t>validador-consistencias-rem.rar</w:t>
+      </w:r>
+      <w:r>
+        <w:rPr>
+          <w:b w:val="0"/>
+          <w:bCs w:val="0"/>
           <w:i/>
           <w:iCs/>
           <w:sz w:val="20"/>
           <w:szCs w:val="20"/>
         </w:rPr>
-        <w:t>”.</w:t>
-      </w:r>
-      <w:r>
-        <w:rPr>
-          <w:rFonts w:ascii="Segoe UI Light" w:hAnsi="Segoe UI Light" w:cs="Segoe UI Light"/>
-          <w:sz w:val="20"/>
-          <w:szCs w:val="20"/>
-        </w:rPr>
-        <w:t xml:space="preserve"> “</w:t>
-      </w:r>
-      <w:r>
-        <w:rPr>
-          <w:rFonts w:ascii="Segoe UI Light" w:hAnsi="Segoe UI Light" w:cs="Segoe UI Light"/>
+        <w:t>”</w:t>
+      </w:r>
+      <w:r>
+        <w:rPr>
+          <w:b w:val="0"/>
+          <w:bCs w:val="0"/>
+          <w:sz w:val="20"/>
+          <w:szCs w:val="20"/>
+        </w:rPr>
+        <w:t xml:space="preserve"> correspondiente a la versión vigente.</w:t>
+      </w:r>
+      <w:bookmarkEnd w:id="14"/>
+    </w:p>
+    <w:p>
+      <w:pPr>
+        <w:pStyle w:val="Titulo"/>
+        <w:numPr>
+          <w:ilvl w:val="0"/>
+          <w:numId w:val="20"/>
+        </w:numPr>
+        <w:rPr>
+          <w:b w:val="0"/>
+          <w:bCs w:val="0"/>
+          <w:sz w:val="20"/>
+          <w:szCs w:val="20"/>
+        </w:rPr>
+      </w:pPr>
+      <w:bookmarkStart w:id="15" w:name="_Toc234422426"/>
+      <w:r>
+        <w:rPr>
+          <w:b w:val="0"/>
+          <w:bCs w:val="0"/>
+          <w:sz w:val="20"/>
+          <w:szCs w:val="20"/>
+        </w:rPr>
+        <w:t>Descomprimir el archivo en la ubicación de su preferencia utilizando una herramienta de descompresión (por ejemplo, WinRAR o 7-Zip).</w:t>
+      </w:r>
+      <w:bookmarkEnd w:id="15"/>
+    </w:p>
+    <w:p>
+      <w:pPr>
+        <w:pStyle w:val="Titulo"/>
+        <w:numPr>
+          <w:ilvl w:val="0"/>
+          <w:numId w:val="20"/>
+        </w:numPr>
+        <w:rPr>
+          <w:b w:val="0"/>
+          <w:bCs w:val="0"/>
+          <w:sz w:val="20"/>
+          <w:szCs w:val="20"/>
+        </w:rPr>
+      </w:pPr>
+      <w:bookmarkStart w:id="16" w:name="_Toc234422427"/>
+      <w:r>
+        <w:rPr>
+          <w:b w:val="0"/>
+          <w:bCs w:val="0"/>
+          <w:sz w:val="20"/>
+          <w:szCs w:val="20"/>
+        </w:rPr>
+        <w:t xml:space="preserve">Una vez descomprimido el archivo, se obtendrá una carpeta denominada </w:t>
+      </w:r>
+      <w:r>
+        <w:rPr>
+          <w:b w:val="0"/>
+          <w:bCs w:val="0"/>
           <w:i/>
           <w:iCs/>
           <w:sz w:val="20"/>
           <w:szCs w:val="20"/>
         </w:rPr>
-        <w:t>Figura 1: Directorio del aplicativo</w:t>
-      </w:r>
-      <w:r>
-        <w:rPr>
-          <w:rFonts w:ascii="Segoe UI Light" w:hAnsi="Segoe UI Light" w:cs="Segoe UI Light"/>
-          <w:sz w:val="20"/>
-          <w:szCs w:val="20"/>
-        </w:rPr>
-        <w:t>.”</w:t>
-      </w:r>
-    </w:p>
-    <w:p>
-      <w:pPr>
-        <w:rPr>
-          <w:rFonts w:ascii="Segoe UI Light" w:hAnsi="Segoe UI Light" w:cs="Segoe UI Light"/>
-          <w:sz w:val="20"/>
-          <w:szCs w:val="20"/>
-        </w:rPr>
-      </w:pPr>
-      <w:r>
-        <w:rPr>
-          <w:rFonts w:ascii="Segoe UI Light" w:hAnsi="Segoe UI Light" w:cs="Segoe UI Light"/>
-          <w:sz w:val="20"/>
-          <w:szCs w:val="20"/>
-        </w:rPr>
-        <w:t>Dentro de este directorio principal deben existir los siguientes elementos:</w:t>
-      </w:r>
-    </w:p>
-    <w:p>
-      <w:pPr>
-        <w:pStyle w:val="Prrafodelista"/>
-        <w:numPr>
-          <w:ilvl w:val="0"/>
-          <w:numId w:val="13"/>
-        </w:numPr>
-        <w:spacing w:after="160" w:line="278" w:lineRule="auto"/>
-        <w:rPr>
-          <w:rFonts w:ascii="Segoe UI Light" w:hAnsi="Segoe UI Light" w:cs="Segoe UI Light"/>
-          <w:sz w:val="20"/>
-          <w:szCs w:val="20"/>
-        </w:rPr>
-      </w:pPr>
-      <w:r>
-        <w:rPr>
-          <w:rFonts w:ascii="Segoe UI Light" w:hAnsi="Segoe UI Light" w:cs="Segoe UI Light"/>
-          <w:b/>
-          <w:bCs/>
-          <w:sz w:val="20"/>
-          <w:szCs w:val="20"/>
-        </w:rPr>
-        <w:t>Validador:</w:t>
-      </w:r>
-      <w:r>
-        <w:rPr>
-          <w:rFonts w:ascii="Segoe UI Light" w:hAnsi="Segoe UI Light" w:cs="Segoe UI Light"/>
-          <w:sz w:val="20"/>
-          <w:szCs w:val="20"/>
-        </w:rPr>
-        <w:t xml:space="preserve"> Directorio principal donde se ejecutará el aplicativo y se alojará toda la estructura necesaria para su funcionamiento.</w:t>
-      </w:r>
-    </w:p>
-    <w:p>
-      <w:pPr>
-        <w:pStyle w:val="Prrafodelista"/>
-        <w:numPr>
-          <w:ilvl w:val="0"/>
-          <w:numId w:val="13"/>
-        </w:numPr>
-        <w:spacing w:after="160" w:line="278" w:lineRule="auto"/>
-        <w:rPr>
-          <w:rFonts w:ascii="Segoe UI Light" w:hAnsi="Segoe UI Light" w:cs="Segoe UI Light"/>
-          <w:sz w:val="20"/>
-          <w:szCs w:val="20"/>
-        </w:rPr>
-      </w:pPr>
-      <w:r>
-        <w:rPr>
-          <w:rFonts w:ascii="Segoe UI Light" w:hAnsi="Segoe UI Light" w:cs="Segoe UI Light"/>
-          <w:b/>
-          <w:bCs/>
-          <w:sz w:val="20"/>
-          <w:szCs w:val="20"/>
-        </w:rPr>
-        <w:t>Control:</w:t>
-      </w:r>
-      <w:r>
-        <w:rPr>
-          <w:rFonts w:ascii="Segoe UI Light" w:hAnsi="Segoe UI Light" w:cs="Segoe UI Light"/>
-          <w:sz w:val="20"/>
-          <w:szCs w:val="20"/>
-        </w:rPr>
-        <w:t xml:space="preserve"> Subdirectorio que contiene los archivos de configuración esenciales para el funcionamiento del aplicativo. Incluye:</w:t>
-      </w:r>
-    </w:p>
-    <w:p>
-      <w:pPr>
-        <w:pStyle w:val="Prrafodelista"/>
-        <w:numPr>
-          <w:ilvl w:val="0"/>
-          <w:numId w:val="11"/>
-        </w:numPr>
-        <w:spacing w:after="160" w:line="278" w:lineRule="auto"/>
-        <w:rPr>
-          <w:rFonts w:ascii="Segoe UI Light" w:hAnsi="Segoe UI Light" w:cs="Segoe UI Light"/>
-          <w:b/>
-          <w:bCs/>
-          <w:sz w:val="20"/>
-          <w:szCs w:val="20"/>
-        </w:rPr>
-      </w:pPr>
-      <w:r>
-        <w:rPr>
-          <w:rFonts w:ascii="Segoe UI Light" w:hAnsi="Segoe UI Light" w:cs="Segoe UI Light"/>
-          <w:b/>
-          <w:bCs/>
-          <w:sz w:val="20"/>
-          <w:szCs w:val="20"/>
-        </w:rPr>
-        <w:t>alerta_fin.wav:</w:t>
-      </w:r>
-      <w:r>
-        <w:rPr>
-          <w:rFonts w:ascii="Segoe UI Light" w:hAnsi="Segoe UI Light" w:cs="Segoe UI Light"/>
-          <w:sz w:val="20"/>
-          <w:szCs w:val="20"/>
-        </w:rPr>
-        <w:t xml:space="preserve"> Archivo de sonido que indica la finalización del proceso.</w:t>
-      </w:r>
-    </w:p>
-    <w:p>
-      <w:pPr>
-        <w:pStyle w:val="Prrafodelista"/>
-        <w:numPr>
-          <w:ilvl w:val="0"/>
-          <w:numId w:val="11"/>
-        </w:numPr>
-        <w:spacing w:after="160" w:line="278" w:lineRule="auto"/>
-        <w:rPr>
-          <w:rFonts w:ascii="Segoe UI Light" w:hAnsi="Segoe UI Light" w:cs="Segoe UI Light"/>
-          <w:b/>
-          <w:bCs/>
-          <w:sz w:val="20"/>
-          <w:szCs w:val="20"/>
-        </w:rPr>
-      </w:pPr>
-      <w:r>
-        <w:rPr>
-          <w:rFonts w:ascii="Segoe UI Light" w:hAnsi="Segoe UI Light" w:cs="Segoe UI Light"/>
-          <w:b/>
-          <w:bCs/>
-          <w:sz w:val="20"/>
-          <w:szCs w:val="20"/>
-        </w:rPr>
-        <w:t>control.json:</w:t>
-      </w:r>
-      <w:r>
-        <w:rPr>
-          <w:rFonts w:ascii="Segoe UI Light" w:hAnsi="Segoe UI Light" w:cs="Segoe UI Light"/>
-          <w:sz w:val="20"/>
-          <w:szCs w:val="20"/>
-        </w:rPr>
-        <w:t xml:space="preserve"> Archivo que define las coordenadas específicas de cada REM, incluyendo secciones y series.</w:t>
-      </w:r>
-    </w:p>
-    <w:p>
-      <w:pPr>
-        <w:pStyle w:val="Prrafodelista"/>
-        <w:numPr>
-          <w:ilvl w:val="0"/>
-          <w:numId w:val="11"/>
-        </w:numPr>
-        <w:spacing w:after="160" w:line="278" w:lineRule="auto"/>
-        <w:rPr>
-          <w:rFonts w:ascii="Segoe UI Light" w:hAnsi="Segoe UI Light" w:cs="Segoe UI Light"/>
-          <w:b/>
-          <w:bCs/>
-          <w:sz w:val="20"/>
-          <w:szCs w:val="20"/>
-        </w:rPr>
-      </w:pPr>
-      <w:r>
-        <w:rPr>
-          <w:rFonts w:ascii="Segoe UI Light" w:hAnsi="Segoe UI Light" w:cs="Segoe UI Light"/>
-          <w:b/>
-          <w:bCs/>
-          <w:sz w:val="20"/>
-          <w:szCs w:val="20"/>
-        </w:rPr>
-        <w:t>control-versiones.json:</w:t>
-      </w:r>
-      <w:r>
-        <w:rPr>
-          <w:rFonts w:ascii="Segoe UI Light" w:hAnsi="Segoe UI Light" w:cs="Segoe UI Light"/>
-          <w:sz w:val="20"/>
-          <w:szCs w:val="20"/>
-        </w:rPr>
-        <w:t xml:space="preserve"> Archivo que contiene el detalle de las versiones correspondientes a cada serie del año en curso.</w:t>
-      </w:r>
-    </w:p>
-    <w:p>
-      <w:pPr>
-        <w:pStyle w:val="Prrafodelista"/>
-        <w:numPr>
-          <w:ilvl w:val="0"/>
-          <w:numId w:val="11"/>
-        </w:numPr>
-        <w:spacing w:after="160" w:line="278" w:lineRule="auto"/>
-        <w:rPr>
-          <w:rFonts w:ascii="Segoe UI Light" w:hAnsi="Segoe UI Light" w:cs="Segoe UI Light"/>
-          <w:sz w:val="20"/>
-          <w:szCs w:val="20"/>
-        </w:rPr>
-      </w:pPr>
-      <w:r>
-        <w:rPr>
-          <w:rFonts w:ascii="Segoe UI Light" w:hAnsi="Segoe UI Light" w:cs="Segoe UI Light"/>
-          <w:b/>
-          <w:bCs/>
-          <w:sz w:val="20"/>
-          <w:szCs w:val="20"/>
-        </w:rPr>
-        <w:t xml:space="preserve">establecimientos-deis-minsal.xlsx: </w:t>
-      </w:r>
-      <w:r>
-        <w:rPr>
-          <w:rFonts w:ascii="Segoe UI Light" w:hAnsi="Segoe UI Light" w:cs="Segoe UI Light"/>
-          <w:sz w:val="20"/>
-          <w:szCs w:val="20"/>
-        </w:rPr>
-        <w:t xml:space="preserve">Archivo con los datos oficiales de los establecimientos de salud del país. Estos datos son públicos y se obtienen desde el sitio oficial del DEIS del MINSAL, sección “DATOS ABIERTOS” “Establecimientos de Salud”.  </w:t>
-      </w:r>
-      <w:hyperlink r:id="rId9" w:history="1">
-        <w:r>
-          <w:rPr>
-            <w:rStyle w:val="Hipervnculo"/>
-            <w:rFonts w:ascii="Segoe UI Light" w:hAnsi="Segoe UI Light" w:cs="Segoe UI Light"/>
-            <w:sz w:val="20"/>
-            <w:szCs w:val="20"/>
-          </w:rPr>
-          <w:t>https://deis.minsal.cl/</w:t>
-        </w:r>
-      </w:hyperlink>
-      <w:r>
-        <w:rPr>
-          <w:rFonts w:ascii="Segoe UI Light" w:hAnsi="Segoe UI Light" w:cs="Segoe UI Light"/>
-          <w:sz w:val="20"/>
-          <w:szCs w:val="20"/>
-        </w:rPr>
-        <w:t>. Además, contiene el consolidado de nombres “no oficiales” usados por cada establecimiento.</w:t>
-      </w:r>
-    </w:p>
-    <w:p>
-      <w:pPr>
-        <w:pStyle w:val="Prrafodelista"/>
-        <w:numPr>
-          <w:ilvl w:val="0"/>
-          <w:numId w:val="11"/>
-        </w:numPr>
-        <w:spacing w:after="160" w:line="278" w:lineRule="auto"/>
-        <w:rPr>
-          <w:rFonts w:ascii="Segoe UI Light" w:hAnsi="Segoe UI Light" w:cs="Segoe UI Light"/>
-          <w:sz w:val="20"/>
-          <w:szCs w:val="20"/>
-        </w:rPr>
-      </w:pPr>
-      <w:r>
-        <w:rPr>
-          <w:rFonts w:ascii="Segoe UI Light" w:hAnsi="Segoe UI Light" w:cs="Segoe UI Light"/>
-          <w:b/>
-          <w:bCs/>
-          <w:sz w:val="20"/>
-          <w:szCs w:val="20"/>
-        </w:rPr>
-        <w:t xml:space="preserve">control-consistencias.csv: </w:t>
-      </w:r>
-      <w:r>
-        <w:rPr>
-          <w:rFonts w:ascii="Segoe UI Light" w:hAnsi="Segoe UI Light" w:cs="Segoe UI Light"/>
-          <w:sz w:val="20"/>
-          <w:szCs w:val="20"/>
-        </w:rPr>
-        <w:t>Archivo de configuración que almacena las reglas de validación de consistencia entre los distintos REM. Define qué datos se comparan, cómo se obtienen los valores y qué condición lógica debe cumplirse para que la validación sea satisfactoria.</w:t>
-      </w:r>
-    </w:p>
-    <w:p>
-      <w:pPr>
-        <w:pStyle w:val="Prrafodelista"/>
-        <w:numPr>
-          <w:ilvl w:val="0"/>
-          <w:numId w:val="13"/>
-        </w:numPr>
-        <w:spacing w:after="160" w:line="278" w:lineRule="auto"/>
-        <w:rPr>
-          <w:rFonts w:ascii="Segoe UI Light" w:hAnsi="Segoe UI Light" w:cs="Segoe UI Light"/>
+        <w:t>“</w:t>
+      </w:r>
+      <w:r>
+        <w:rPr>
+          <w:b w:val="0"/>
+          <w:bCs w:val="0"/>
           <w:i/>
           <w:iCs/>
           <w:sz w:val="20"/>
           <w:szCs w:val="20"/>
         </w:rPr>
-      </w:pPr>
-      <w:r>
-        <w:rPr>
-          <w:rFonts w:ascii="Segoe UI Light" w:hAnsi="Segoe UI Light" w:cs="Segoe UI Light"/>
-          <w:b/>
-          <w:bCs/>
-          <w:sz w:val="20"/>
-          <w:szCs w:val="20"/>
-        </w:rPr>
-        <w:t>rem:</w:t>
-      </w:r>
-      <w:r>
-        <w:rPr>
-          <w:rFonts w:ascii="Segoe UI Light" w:hAnsi="Segoe UI Light" w:cs="Segoe UI Light"/>
-          <w:sz w:val="20"/>
-          <w:szCs w:val="20"/>
-        </w:rPr>
-        <w:t xml:space="preserve"> Subdirectorio en el cual el usuario debe depositar los archivos REM que se desea validar y comparar. Los archivos deben seguir estrictamente el siguiente formato de nombre: “111100A01V1.xlsm”, </w:t>
-      </w:r>
-      <w:r>
-        <w:rPr>
-          <w:rFonts w:ascii="Segoe UI Light" w:hAnsi="Segoe UI Light" w:cs="Segoe UI Light"/>
-          <w:b/>
-          <w:bCs/>
-          <w:sz w:val="20"/>
-          <w:szCs w:val="20"/>
-        </w:rPr>
-        <w:t>Todo el nombre debe estar en mayúsculas</w:t>
-      </w:r>
-      <w:r>
-        <w:rPr>
-          <w:rFonts w:ascii="Segoe UI Light" w:hAnsi="Segoe UI Light" w:cs="Segoe UI Light"/>
-          <w:sz w:val="20"/>
-          <w:szCs w:val="20"/>
-        </w:rPr>
-        <w:t xml:space="preserve">, y su estructura se detalla en </w:t>
-      </w:r>
-      <w:r>
-        <w:rPr>
-          <w:rFonts w:ascii="Segoe UI Light" w:hAnsi="Segoe UI Light" w:cs="Segoe UI Light"/>
+        <w:t>validador-consistencias-rem</w:t>
+      </w:r>
+      <w:r>
+        <w:rPr>
+          <w:b w:val="0"/>
+          <w:bCs w:val="0"/>
           <w:i/>
           <w:iCs/>
           <w:sz w:val="20"/>
           <w:szCs w:val="20"/>
         </w:rPr>
-        <w:t>“Figura 2: Tabla desglose del nombre del archivo REM.”</w:t>
-      </w:r>
+        <w:t xml:space="preserve">” </w:t>
+      </w:r>
+      <w:r>
+        <w:rPr>
+          <w:b w:val="0"/>
+          <w:bCs w:val="0"/>
+          <w:sz w:val="20"/>
+          <w:szCs w:val="20"/>
+        </w:rPr>
+        <w:t>la</w:t>
+      </w:r>
+      <w:r>
+        <w:rPr>
+          <w:b w:val="0"/>
+          <w:bCs w:val="0"/>
+          <w:sz w:val="20"/>
+          <w:szCs w:val="20"/>
+        </w:rPr>
+        <w:t xml:space="preserve"> cual puede ser nombrad</w:t>
+      </w:r>
+      <w:r>
+        <w:rPr>
+          <w:b w:val="0"/>
+          <w:bCs w:val="0"/>
+          <w:sz w:val="20"/>
+          <w:szCs w:val="20"/>
+        </w:rPr>
+        <w:t>a</w:t>
+      </w:r>
+      <w:r>
+        <w:rPr>
+          <w:b w:val="0"/>
+          <w:bCs w:val="0"/>
+          <w:sz w:val="20"/>
+          <w:szCs w:val="20"/>
+        </w:rPr>
+        <w:t xml:space="preserve"> libremente por el usuario y cuya estructura debe ser como muestra la “</w:t>
+      </w:r>
+      <w:r>
+        <w:rPr>
+          <w:rFonts w:cs="Segoe UI Light"/>
+          <w:b w:val="0"/>
+          <w:bCs w:val="0"/>
+          <w:i/>
+          <w:iCs/>
+          <w:sz w:val="20"/>
+          <w:szCs w:val="20"/>
+        </w:rPr>
+        <w:t>Figura 1: Directorio del aplicativo</w:t>
+      </w:r>
+      <w:r>
+        <w:rPr>
+          <w:rFonts w:cs="Segoe UI Light"/>
+          <w:b w:val="0"/>
+          <w:bCs w:val="0"/>
+          <w:sz w:val="20"/>
+          <w:szCs w:val="20"/>
+        </w:rPr>
+        <w:t>”</w:t>
+      </w:r>
+      <w:r>
+        <w:rPr>
+          <w:b w:val="0"/>
+          <w:bCs w:val="0"/>
+          <w:sz w:val="20"/>
+          <w:szCs w:val="20"/>
+        </w:rPr>
+        <w:t>.</w:t>
+      </w:r>
+      <w:bookmarkEnd w:id="16"/>
+    </w:p>
+    <w:p>
+      <w:pPr>
+        <w:pStyle w:val="Titulo"/>
+        <w:ind w:left="360"/>
+        <w:rPr>
+          <w:b w:val="0"/>
+          <w:bCs w:val="0"/>
+          <w:sz w:val="20"/>
+          <w:szCs w:val="20"/>
+        </w:rPr>
+      </w:pPr>
     </w:p>
     <w:p>
       <w:pPr>
         <w:pStyle w:val="Prrafodelista"/>
-        <w:numPr>
-          <w:ilvl w:val="0"/>
-          <w:numId w:val="13"/>
-        </w:numPr>
-        <w:spacing w:after="160" w:line="278" w:lineRule="auto"/>
-        <w:rPr>
-          <w:rFonts w:ascii="Segoe UI Light" w:hAnsi="Segoe UI Light" w:cs="Segoe UI Light"/>
-          <w:b/>
-          <w:bCs/>
-          <w:sz w:val="20"/>
-          <w:szCs w:val="20"/>
-        </w:rPr>
-      </w:pPr>
-      <w:r>
-        <w:rPr>
-          <w:rFonts w:ascii="Segoe UI Light" w:hAnsi="Segoe UI Light" w:cs="Segoe UI Light"/>
-          <w:b/>
-          <w:bCs/>
-          <w:sz w:val="20"/>
-          <w:szCs w:val="20"/>
-        </w:rPr>
-        <w:t>validador.exe:</w:t>
-      </w:r>
-      <w:r>
-        <w:rPr>
-          <w:rFonts w:ascii="Segoe UI Light" w:hAnsi="Segoe UI Light" w:cs="Segoe UI Light"/>
-          <w:sz w:val="20"/>
-          <w:szCs w:val="20"/>
-        </w:rPr>
-        <w:t xml:space="preserve"> Archivo ejecutable principal del aplicativo.</w:t>
-      </w:r>
-    </w:p>
-    <w:p>
-      <w:pPr>
         <w:jc w:val="center"/>
         <w:rPr>
           <w:sz w:val="20"/>
@@ -3503,13 +3398,11 @@
       <w:r>
         <w:rPr>
           <w:noProof/>
-          <w:sz w:val="20"/>
-          <w:szCs w:val="20"/>
           <w:vertAlign w:val="superscript"/>
         </w:rPr>
         <w:lastRenderedPageBreak/>
         <w:drawing>
-          <wp:inline distT="0" distB="0" distL="0" distR="0" wp14:anchorId="46B7D799" wp14:editId="4E1B0FDC">
+          <wp:inline distT="0" distB="0" distL="0" distR="0" wp14:anchorId="7D4F22BE" wp14:editId="5FF4CF07">
             <wp:extent cx="2819794" cy="3296110"/>
             <wp:effectExtent l="19050" t="19050" r="19050" b="19050"/>
             <wp:docPr id="1620939176" name="Imagen 12"/>
@@ -3524,7 +3417,7 @@
                     <pic:cNvPicPr/>
                   </pic:nvPicPr>
                   <pic:blipFill>
-                    <a:blip r:embed="rId10">
+                    <a:blip r:embed="rId9">
                       <a:extLst>
                         <a:ext uri="{28A0092B-C50C-407E-A947-70E740481C1C}">
                           <a14:useLocalDpi xmlns:a14="http://schemas.microsoft.com/office/drawing/2010/main" val="0"/>
@@ -3558,6 +3451,7 @@
     </w:p>
     <w:p>
       <w:pPr>
+        <w:pStyle w:val="Prrafodelista"/>
         <w:jc w:val="center"/>
         <w:rPr>
           <w:rFonts w:ascii="Segoe UI Light" w:hAnsi="Segoe UI Light" w:cs="Segoe UI Light"/>
@@ -3574,6 +3468,498 @@
           <w:vertAlign w:val="superscript"/>
         </w:rPr>
         <w:t>Figura 1: Directorio del aplicativo.</w:t>
+      </w:r>
+    </w:p>
+    <w:p>
+      <w:pPr>
+        <w:pStyle w:val="Titulo"/>
+        <w:ind w:left="720"/>
+        <w:rPr>
+          <w:b w:val="0"/>
+          <w:bCs w:val="0"/>
+          <w:sz w:val="20"/>
+          <w:szCs w:val="20"/>
+        </w:rPr>
+      </w:pPr>
+    </w:p>
+    <w:p>
+      <w:pPr>
+        <w:pStyle w:val="Titulo"/>
+        <w:rPr>
+          <w:b w:val="0"/>
+          <w:bCs w:val="0"/>
+        </w:rPr>
+      </w:pPr>
+    </w:p>
+    <w:p>
+      <w:pPr>
+        <w:pStyle w:val="Titulo"/>
+      </w:pPr>
+      <w:bookmarkStart w:id="17" w:name="_Toc234422428"/>
+      <w:r>
+        <w:t>REQUISITOS</w:t>
+      </w:r>
+      <w:bookmarkEnd w:id="17"/>
+    </w:p>
+    <w:p>
+      <w:pPr>
+        <w:rPr>
+          <w:rFonts w:ascii="Segoe UI Light" w:hAnsi="Segoe UI Light" w:cs="Segoe UI Light"/>
+          <w:sz w:val="20"/>
+          <w:szCs w:val="20"/>
+        </w:rPr>
+      </w:pPr>
+      <w:r>
+        <w:rPr>
+          <w:rFonts w:ascii="Segoe UI Light" w:hAnsi="Segoe UI Light" w:cs="Segoe UI Light"/>
+          <w:sz w:val="20"/>
+          <w:szCs w:val="20"/>
+        </w:rPr>
+        <w:t xml:space="preserve">Para ejecutar el aplicativo, es necesario contar con </w:t>
+      </w:r>
+      <w:r>
+        <w:rPr>
+          <w:rFonts w:ascii="Segoe UI Light" w:hAnsi="Segoe UI Light" w:cs="Segoe UI Light"/>
+          <w:sz w:val="20"/>
+          <w:szCs w:val="20"/>
+        </w:rPr>
+        <w:t>el</w:t>
+      </w:r>
+      <w:r>
+        <w:rPr>
+          <w:rFonts w:ascii="Segoe UI Light" w:hAnsi="Segoe UI Light" w:cs="Segoe UI Light"/>
+          <w:sz w:val="20"/>
+          <w:szCs w:val="20"/>
+        </w:rPr>
+        <w:t xml:space="preserve"> directorio principal</w:t>
+      </w:r>
+      <w:r>
+        <w:rPr>
+          <w:rFonts w:ascii="Segoe UI Light" w:hAnsi="Segoe UI Light" w:cs="Segoe UI Light"/>
+          <w:b/>
+          <w:bCs/>
+          <w:sz w:val="20"/>
+          <w:szCs w:val="20"/>
+        </w:rPr>
+        <w:t xml:space="preserve"> </w:t>
+      </w:r>
+      <w:r>
+        <w:rPr>
+          <w:rFonts w:ascii="Segoe UI Light" w:hAnsi="Segoe UI Light" w:cs="Segoe UI Light"/>
+          <w:i/>
+          <w:iCs/>
+          <w:sz w:val="20"/>
+          <w:szCs w:val="20"/>
+        </w:rPr>
+        <w:t>“</w:t>
+      </w:r>
+      <w:r>
+        <w:rPr>
+          <w:rFonts w:ascii="Segoe UI Light" w:hAnsi="Segoe UI Light" w:cs="Segoe UI Light"/>
+          <w:i/>
+          <w:iCs/>
+          <w:sz w:val="20"/>
+          <w:szCs w:val="20"/>
+        </w:rPr>
+        <w:t>validador-consistencias-rem</w:t>
+      </w:r>
+      <w:r>
+        <w:rPr>
+          <w:rFonts w:ascii="Segoe UI Light" w:hAnsi="Segoe UI Light" w:cs="Segoe UI Light"/>
+          <w:i/>
+          <w:iCs/>
+          <w:sz w:val="20"/>
+          <w:szCs w:val="20"/>
+        </w:rPr>
+        <w:t>”.</w:t>
+      </w:r>
+      <w:r>
+        <w:rPr>
+          <w:rFonts w:ascii="Segoe UI Light" w:hAnsi="Segoe UI Light" w:cs="Segoe UI Light"/>
+          <w:sz w:val="20"/>
+          <w:szCs w:val="20"/>
+        </w:rPr>
+        <w:t xml:space="preserve"> </w:t>
+      </w:r>
+    </w:p>
+    <w:p>
+      <w:pPr>
+        <w:rPr>
+          <w:rFonts w:ascii="Segoe UI Light" w:hAnsi="Segoe UI Light" w:cs="Segoe UI Light"/>
+          <w:sz w:val="20"/>
+          <w:szCs w:val="20"/>
+        </w:rPr>
+      </w:pPr>
+      <w:r>
+        <w:rPr>
+          <w:rFonts w:ascii="Segoe UI Light" w:hAnsi="Segoe UI Light" w:cs="Segoe UI Light"/>
+          <w:sz w:val="20"/>
+          <w:szCs w:val="20"/>
+        </w:rPr>
+        <w:t>Dentro de este directorio principal deben existir los siguientes elementos:</w:t>
+      </w:r>
+    </w:p>
+    <w:p>
+      <w:pPr>
+        <w:pStyle w:val="Prrafodelista"/>
+        <w:numPr>
+          <w:ilvl w:val="0"/>
+          <w:numId w:val="13"/>
+        </w:numPr>
+        <w:spacing w:after="160" w:line="278" w:lineRule="auto"/>
+        <w:rPr>
+          <w:rFonts w:ascii="Segoe UI Light" w:hAnsi="Segoe UI Light" w:cs="Segoe UI Light"/>
+          <w:sz w:val="20"/>
+          <w:szCs w:val="20"/>
+        </w:rPr>
+      </w:pPr>
+      <w:r>
+        <w:rPr>
+          <w:rFonts w:ascii="Segoe UI Light" w:hAnsi="Segoe UI Light" w:cs="Segoe UI Light"/>
+          <w:b/>
+          <w:bCs/>
+          <w:sz w:val="20"/>
+          <w:szCs w:val="20"/>
+        </w:rPr>
+        <w:t>Validador:</w:t>
+      </w:r>
+      <w:r>
+        <w:rPr>
+          <w:rFonts w:ascii="Segoe UI Light" w:hAnsi="Segoe UI Light" w:cs="Segoe UI Light"/>
+          <w:sz w:val="20"/>
+          <w:szCs w:val="20"/>
+        </w:rPr>
+        <w:t xml:space="preserve"> Directorio principal donde se ejecutará el aplicativo y se alojará toda la estructura necesaria para su funcionamiento.</w:t>
+      </w:r>
+    </w:p>
+    <w:p>
+      <w:pPr>
+        <w:pStyle w:val="Prrafodelista"/>
+        <w:numPr>
+          <w:ilvl w:val="0"/>
+          <w:numId w:val="13"/>
+        </w:numPr>
+        <w:spacing w:after="160" w:line="278" w:lineRule="auto"/>
+        <w:rPr>
+          <w:rFonts w:ascii="Segoe UI Light" w:hAnsi="Segoe UI Light" w:cs="Segoe UI Light"/>
+          <w:sz w:val="20"/>
+          <w:szCs w:val="20"/>
+        </w:rPr>
+      </w:pPr>
+      <w:r>
+        <w:rPr>
+          <w:rFonts w:ascii="Segoe UI Light" w:hAnsi="Segoe UI Light" w:cs="Segoe UI Light"/>
+          <w:b/>
+          <w:bCs/>
+          <w:sz w:val="20"/>
+          <w:szCs w:val="20"/>
+        </w:rPr>
+        <w:t>Control:</w:t>
+      </w:r>
+      <w:r>
+        <w:rPr>
+          <w:rFonts w:ascii="Segoe UI Light" w:hAnsi="Segoe UI Light" w:cs="Segoe UI Light"/>
+          <w:sz w:val="20"/>
+          <w:szCs w:val="20"/>
+        </w:rPr>
+        <w:t xml:space="preserve"> Subdirectorio que contiene los archivos de configuración esenciales para el funcionamiento del aplicativo. Incluye:</w:t>
+      </w:r>
+    </w:p>
+    <w:p>
+      <w:pPr>
+        <w:pStyle w:val="Prrafodelista"/>
+        <w:numPr>
+          <w:ilvl w:val="0"/>
+          <w:numId w:val="11"/>
+        </w:numPr>
+        <w:spacing w:after="160" w:line="278" w:lineRule="auto"/>
+        <w:rPr>
+          <w:rFonts w:ascii="Segoe UI Light" w:hAnsi="Segoe UI Light" w:cs="Segoe UI Light"/>
+          <w:b/>
+          <w:bCs/>
+          <w:sz w:val="20"/>
+          <w:szCs w:val="20"/>
+        </w:rPr>
+      </w:pPr>
+      <w:r>
+        <w:rPr>
+          <w:rFonts w:ascii="Segoe UI Light" w:hAnsi="Segoe UI Light" w:cs="Segoe UI Light"/>
+          <w:b/>
+          <w:bCs/>
+          <w:sz w:val="20"/>
+          <w:szCs w:val="20"/>
+        </w:rPr>
+        <w:t>alerta_fin.wav:</w:t>
+      </w:r>
+      <w:r>
+        <w:rPr>
+          <w:rFonts w:ascii="Segoe UI Light" w:hAnsi="Segoe UI Light" w:cs="Segoe UI Light"/>
+          <w:sz w:val="20"/>
+          <w:szCs w:val="20"/>
+        </w:rPr>
+        <w:t xml:space="preserve"> Archivo de sonido que indica la finalización del proceso.</w:t>
+      </w:r>
+    </w:p>
+    <w:p>
+      <w:pPr>
+        <w:pStyle w:val="Prrafodelista"/>
+        <w:numPr>
+          <w:ilvl w:val="0"/>
+          <w:numId w:val="11"/>
+        </w:numPr>
+        <w:spacing w:after="160" w:line="278" w:lineRule="auto"/>
+        <w:rPr>
+          <w:rFonts w:ascii="Segoe UI Light" w:hAnsi="Segoe UI Light" w:cs="Segoe UI Light"/>
+          <w:b/>
+          <w:bCs/>
+          <w:sz w:val="20"/>
+          <w:szCs w:val="20"/>
+        </w:rPr>
+      </w:pPr>
+      <w:r>
+        <w:rPr>
+          <w:rFonts w:ascii="Segoe UI Light" w:hAnsi="Segoe UI Light" w:cs="Segoe UI Light"/>
+          <w:b/>
+          <w:bCs/>
+          <w:sz w:val="20"/>
+          <w:szCs w:val="20"/>
+        </w:rPr>
+        <w:t>control.json:</w:t>
+      </w:r>
+      <w:r>
+        <w:rPr>
+          <w:rFonts w:ascii="Segoe UI Light" w:hAnsi="Segoe UI Light" w:cs="Segoe UI Light"/>
+          <w:sz w:val="20"/>
+          <w:szCs w:val="20"/>
+        </w:rPr>
+        <w:t xml:space="preserve"> Archivo que define las coordenadas específicas de cada REM, incluyendo secciones y series.</w:t>
+      </w:r>
+    </w:p>
+    <w:p>
+      <w:pPr>
+        <w:pStyle w:val="Prrafodelista"/>
+        <w:numPr>
+          <w:ilvl w:val="0"/>
+          <w:numId w:val="11"/>
+        </w:numPr>
+        <w:spacing w:after="160" w:line="278" w:lineRule="auto"/>
+        <w:rPr>
+          <w:rFonts w:ascii="Segoe UI Light" w:hAnsi="Segoe UI Light" w:cs="Segoe UI Light"/>
+          <w:b/>
+          <w:bCs/>
+          <w:sz w:val="20"/>
+          <w:szCs w:val="20"/>
+        </w:rPr>
+      </w:pPr>
+      <w:r>
+        <w:rPr>
+          <w:rFonts w:ascii="Segoe UI Light" w:hAnsi="Segoe UI Light" w:cs="Segoe UI Light"/>
+          <w:b/>
+          <w:bCs/>
+          <w:sz w:val="20"/>
+          <w:szCs w:val="20"/>
+        </w:rPr>
+        <w:t>control-versiones.json:</w:t>
+      </w:r>
+      <w:r>
+        <w:rPr>
+          <w:rFonts w:ascii="Segoe UI Light" w:hAnsi="Segoe UI Light" w:cs="Segoe UI Light"/>
+          <w:sz w:val="20"/>
+          <w:szCs w:val="20"/>
+        </w:rPr>
+        <w:t xml:space="preserve"> Archivo que contiene el detalle de las versiones correspondientes a cada serie del año en curso.</w:t>
+      </w:r>
+    </w:p>
+    <w:p>
+      <w:pPr>
+        <w:pStyle w:val="Prrafodelista"/>
+        <w:numPr>
+          <w:ilvl w:val="0"/>
+          <w:numId w:val="11"/>
+        </w:numPr>
+        <w:spacing w:after="160" w:line="278" w:lineRule="auto"/>
+        <w:rPr>
+          <w:rFonts w:ascii="Segoe UI Light" w:hAnsi="Segoe UI Light" w:cs="Segoe UI Light"/>
+          <w:sz w:val="20"/>
+          <w:szCs w:val="20"/>
+        </w:rPr>
+      </w:pPr>
+      <w:r>
+        <w:rPr>
+          <w:rFonts w:ascii="Segoe UI Light" w:hAnsi="Segoe UI Light" w:cs="Segoe UI Light"/>
+          <w:b/>
+          <w:bCs/>
+          <w:sz w:val="20"/>
+          <w:szCs w:val="20"/>
+        </w:rPr>
+        <w:t xml:space="preserve">establecimientos-deis-minsal.xlsx: </w:t>
+      </w:r>
+      <w:r>
+        <w:rPr>
+          <w:rFonts w:ascii="Segoe UI Light" w:hAnsi="Segoe UI Light" w:cs="Segoe UI Light"/>
+          <w:sz w:val="20"/>
+          <w:szCs w:val="20"/>
+        </w:rPr>
+        <w:t xml:space="preserve">Archivo con los datos oficiales de los establecimientos de salud del país. Estos datos son públicos y se obtienen desde el sitio oficial del DEIS del MINSAL, sección “DATOS ABIERTOS” “Establecimientos de Salud”.  </w:t>
+      </w:r>
+      <w:hyperlink r:id="rId10" w:history="1">
+        <w:r>
+          <w:rPr>
+            <w:rStyle w:val="Hipervnculo"/>
+            <w:rFonts w:ascii="Segoe UI Light" w:hAnsi="Segoe UI Light" w:cs="Segoe UI Light"/>
+            <w:sz w:val="20"/>
+            <w:szCs w:val="20"/>
+          </w:rPr>
+          <w:t>https://deis.minsal.cl/</w:t>
+        </w:r>
+      </w:hyperlink>
+      <w:r>
+        <w:rPr>
+          <w:rFonts w:ascii="Segoe UI Light" w:hAnsi="Segoe UI Light" w:cs="Segoe UI Light"/>
+          <w:sz w:val="20"/>
+          <w:szCs w:val="20"/>
+        </w:rPr>
+        <w:t xml:space="preserve">. </w:t>
+      </w:r>
+      <w:r>
+        <w:rPr>
+          <w:rFonts w:ascii="Segoe UI Light" w:hAnsi="Segoe UI Light" w:cs="Segoe UI Light"/>
+          <w:sz w:val="20"/>
+          <w:szCs w:val="20"/>
+        </w:rPr>
+        <w:lastRenderedPageBreak/>
+        <w:t>Además, contiene el consolidado de nombres “no oficiales” usados por cada establecimiento.</w:t>
+      </w:r>
+    </w:p>
+    <w:p>
+      <w:pPr>
+        <w:pStyle w:val="Prrafodelista"/>
+        <w:numPr>
+          <w:ilvl w:val="0"/>
+          <w:numId w:val="11"/>
+        </w:numPr>
+        <w:spacing w:after="160" w:line="278" w:lineRule="auto"/>
+        <w:rPr>
+          <w:rFonts w:ascii="Segoe UI Light" w:hAnsi="Segoe UI Light" w:cs="Segoe UI Light"/>
+          <w:sz w:val="20"/>
+          <w:szCs w:val="20"/>
+        </w:rPr>
+      </w:pPr>
+      <w:r>
+        <w:rPr>
+          <w:rFonts w:ascii="Segoe UI Light" w:hAnsi="Segoe UI Light" w:cs="Segoe UI Light"/>
+          <w:b/>
+          <w:bCs/>
+          <w:sz w:val="20"/>
+          <w:szCs w:val="20"/>
+        </w:rPr>
+        <w:t xml:space="preserve">control-consistencias.csv: </w:t>
+      </w:r>
+      <w:r>
+        <w:rPr>
+          <w:rFonts w:ascii="Segoe UI Light" w:hAnsi="Segoe UI Light" w:cs="Segoe UI Light"/>
+          <w:sz w:val="20"/>
+          <w:szCs w:val="20"/>
+        </w:rPr>
+        <w:t>Archivo de configuración que almacena las reglas de validación de consistencia entre los distintos REM. Define qué datos se comparan, cómo se obtienen los valores y qué condición lógica debe cumplirse para que la validación sea satisfactoria.</w:t>
+      </w:r>
+    </w:p>
+    <w:p>
+      <w:pPr>
+        <w:pStyle w:val="Prrafodelista"/>
+        <w:numPr>
+          <w:ilvl w:val="0"/>
+          <w:numId w:val="13"/>
+        </w:numPr>
+        <w:spacing w:after="160" w:line="278" w:lineRule="auto"/>
+        <w:rPr>
+          <w:rFonts w:ascii="Segoe UI Light" w:hAnsi="Segoe UI Light" w:cs="Segoe UI Light"/>
+          <w:i/>
+          <w:iCs/>
+          <w:sz w:val="20"/>
+          <w:szCs w:val="20"/>
+        </w:rPr>
+      </w:pPr>
+      <w:r>
+        <w:rPr>
+          <w:rFonts w:ascii="Segoe UI Light" w:hAnsi="Segoe UI Light" w:cs="Segoe UI Light"/>
+          <w:b/>
+          <w:bCs/>
+          <w:sz w:val="20"/>
+          <w:szCs w:val="20"/>
+        </w:rPr>
+        <w:t>rem:</w:t>
+      </w:r>
+      <w:r>
+        <w:rPr>
+          <w:rFonts w:ascii="Segoe UI Light" w:hAnsi="Segoe UI Light" w:cs="Segoe UI Light"/>
+          <w:sz w:val="20"/>
+          <w:szCs w:val="20"/>
+        </w:rPr>
+        <w:t xml:space="preserve"> Subdirectorio en el cual el usuario debe depositar los archivos REM que se desea validar y comparar. Los archivos deben seguir estrictamente el siguiente formato de nombre: “111100A01V1.xlsm”, </w:t>
+      </w:r>
+      <w:r>
+        <w:rPr>
+          <w:rFonts w:ascii="Segoe UI Light" w:hAnsi="Segoe UI Light" w:cs="Segoe UI Light"/>
+          <w:b/>
+          <w:bCs/>
+          <w:sz w:val="20"/>
+          <w:szCs w:val="20"/>
+        </w:rPr>
+        <w:t>Todo el nombre debe estar en mayúsculas</w:t>
+      </w:r>
+      <w:r>
+        <w:rPr>
+          <w:rFonts w:ascii="Segoe UI Light" w:hAnsi="Segoe UI Light" w:cs="Segoe UI Light"/>
+          <w:sz w:val="20"/>
+          <w:szCs w:val="20"/>
+        </w:rPr>
+        <w:t xml:space="preserve">, y su estructura se detalla en </w:t>
+      </w:r>
+      <w:r>
+        <w:rPr>
+          <w:rFonts w:ascii="Segoe UI Light" w:hAnsi="Segoe UI Light" w:cs="Segoe UI Light"/>
+          <w:i/>
+          <w:iCs/>
+          <w:sz w:val="20"/>
+          <w:szCs w:val="20"/>
+        </w:rPr>
+        <w:t>“Figura 2: Tabla desglose del nombre del archivo REM.”</w:t>
+      </w:r>
+    </w:p>
+    <w:p>
+      <w:pPr>
+        <w:pStyle w:val="Prrafodelista"/>
+        <w:numPr>
+          <w:ilvl w:val="0"/>
+          <w:numId w:val="13"/>
+        </w:numPr>
+        <w:spacing w:after="160" w:line="278" w:lineRule="auto"/>
+        <w:rPr>
+          <w:rFonts w:ascii="Segoe UI Light" w:hAnsi="Segoe UI Light" w:cs="Segoe UI Light"/>
+          <w:b/>
+          <w:bCs/>
+          <w:sz w:val="20"/>
+          <w:szCs w:val="20"/>
+        </w:rPr>
+      </w:pPr>
+      <w:r>
+        <w:rPr>
+          <w:rFonts w:ascii="Segoe UI Light" w:hAnsi="Segoe UI Light" w:cs="Segoe UI Light"/>
+          <w:b/>
+          <w:bCs/>
+          <w:sz w:val="20"/>
+          <w:szCs w:val="20"/>
+        </w:rPr>
+        <w:t>validador.exe:</w:t>
+      </w:r>
+      <w:r>
+        <w:rPr>
+          <w:rFonts w:ascii="Segoe UI Light" w:hAnsi="Segoe UI Light" w:cs="Segoe UI Light"/>
+          <w:sz w:val="20"/>
+          <w:szCs w:val="20"/>
+        </w:rPr>
+        <w:t xml:space="preserve"> Archivo ejecutable principal del aplicativo.</w:t>
       </w:r>
     </w:p>
     <w:p>
@@ -3670,20 +4056,20 @@
           <w:szCs w:val="20"/>
         </w:rPr>
       </w:pPr>
-      <w:bookmarkStart w:id="13" w:name="_Toc213764893"/>
+      <w:bookmarkStart w:id="18" w:name="_Toc213764893"/>
     </w:p>
     <w:p>
       <w:pPr>
         <w:pStyle w:val="Titulo"/>
       </w:pPr>
-      <w:bookmarkStart w:id="14" w:name="_Toc234403684"/>
-      <w:bookmarkStart w:id="15" w:name="_Toc234404044"/>
+      <w:bookmarkStart w:id="19" w:name="_Toc234403684"/>
+      <w:bookmarkStart w:id="20" w:name="_Toc234422429"/>
       <w:r>
         <w:t>EJECUCIÓN DEL APLICATIVO DE VALIDACIÓN REM: Inicio del Proceso</w:t>
       </w:r>
-      <w:bookmarkEnd w:id="13"/>
-      <w:bookmarkEnd w:id="14"/>
-      <w:bookmarkEnd w:id="15"/>
+      <w:bookmarkEnd w:id="18"/>
+      <w:bookmarkEnd w:id="19"/>
+      <w:bookmarkEnd w:id="20"/>
     </w:p>
     <w:p>
       <w:pPr>
@@ -3772,7 +4158,6 @@
           <w:sz w:val="20"/>
           <w:szCs w:val="20"/>
         </w:rPr>
-        <w:lastRenderedPageBreak/>
         <w:t>Una vez verificada la existencia y correcta organización de la estructura descrita en el apartado</w:t>
       </w:r>
       <w:r>
@@ -3881,6 +4266,7 @@
           <w:sz w:val="20"/>
           <w:szCs w:val="20"/>
         </w:rPr>
+        <w:lastRenderedPageBreak/>
         <w:t>Por ejemplo: 111783BM06V1-2025.xlsm</w:t>
       </w:r>
     </w:p>
@@ -4194,9 +4580,9 @@
           <w:rFonts w:cs="Segoe UI Light"/>
         </w:rPr>
       </w:pPr>
-      <w:bookmarkStart w:id="16" w:name="_Toc213764894"/>
-      <w:bookmarkStart w:id="17" w:name="_Toc234403685"/>
-      <w:bookmarkStart w:id="18" w:name="_Toc234404045"/>
+      <w:bookmarkStart w:id="21" w:name="_Toc213764894"/>
+      <w:bookmarkStart w:id="22" w:name="_Toc234403685"/>
+      <w:bookmarkStart w:id="23" w:name="_Toc234422430"/>
       <w:r>
         <w:rPr>
           <w:rFonts w:cs="Segoe UI Light"/>
@@ -4215,9 +4601,9 @@
         </w:rPr>
         <w:t>REM: Archivos de Salida</w:t>
       </w:r>
-      <w:bookmarkEnd w:id="16"/>
-      <w:bookmarkEnd w:id="17"/>
-      <w:bookmarkEnd w:id="18"/>
+      <w:bookmarkEnd w:id="21"/>
+      <w:bookmarkEnd w:id="22"/>
+      <w:bookmarkEnd w:id="23"/>
     </w:p>
     <w:p>
       <w:pPr>
@@ -4526,7 +4912,7 @@
         </w:rPr>
         <w:t>Figura 4: Directorio resultados.</w:t>
       </w:r>
-      <w:bookmarkStart w:id="19" w:name="_Hlk212213707"/>
+      <w:bookmarkStart w:id="24" w:name="_Hlk212213707"/>
     </w:p>
     <w:p>
       <w:pPr>
@@ -4545,7 +4931,8 @@
           <w:bCs w:val="0"/>
         </w:rPr>
       </w:pPr>
-      <w:bookmarkStart w:id="20" w:name="_Toc234404046"/>
+      <w:bookmarkStart w:id="25" w:name="_Toc234404046"/>
+      <w:bookmarkStart w:id="26" w:name="_Toc234422431"/>
       <w:r>
         <w:rPr>
           <w:b w:val="0"/>
@@ -4553,7 +4940,8 @@
         </w:rPr>
         <w:t>ESTRUCTURA REPORTE RESULTADOS-VALIDACIÓN.XLSX:</w:t>
       </w:r>
-      <w:bookmarkEnd w:id="20"/>
+      <w:bookmarkEnd w:id="25"/>
+      <w:bookmarkEnd w:id="26"/>
     </w:p>
     <w:p>
       <w:pPr>
@@ -4639,7 +5027,7 @@
         </w:rPr>
         <w:t>sta hoja contiene los archivos que han sido clasificados como inválidos</w:t>
       </w:r>
-      <w:ins w:id="21" w:author="Karina Stapfer Jara" w:date="2025-11-11T14:41:00Z" w16du:dateUtc="2025-11-11T17:41:00Z">
+      <w:ins w:id="27" w:author="Karina Stapfer Jara" w:date="2025-11-11T14:41:00Z" w16du:dateUtc="2025-11-11T17:41:00Z">
         <w:r>
           <w:rPr>
             <w:rFonts w:ascii="Segoe UI Light" w:hAnsi="Segoe UI Light" w:cs="Segoe UI Light"/>
@@ -4657,7 +5045,7 @@
         </w:rPr>
         <w:t xml:space="preserve"> por alguna de las siguientes razones:</w:t>
       </w:r>
-      <w:bookmarkEnd w:id="19"/>
+      <w:bookmarkEnd w:id="24"/>
     </w:p>
     <w:p>
       <w:pPr>
@@ -4865,7 +5253,7 @@
           <w:szCs w:val="20"/>
         </w:rPr>
       </w:pPr>
-      <w:ins w:id="22" w:author="Karina Stapfer Jara" w:date="2025-11-11T14:40:00Z" w16du:dateUtc="2025-11-11T17:40:00Z">
+      <w:ins w:id="28" w:author="Karina Stapfer Jara" w:date="2025-11-11T14:40:00Z" w16du:dateUtc="2025-11-11T17:40:00Z">
         <w:r>
           <w:rPr>
             <w:rFonts w:ascii="Segoe UI Light" w:hAnsi="Segoe UI Light" w:cs="Segoe UI Light"/>
@@ -5568,7 +5956,7 @@
           <w:vertAlign w:val="superscript"/>
         </w:rPr>
       </w:pPr>
-      <w:bookmarkStart w:id="23" w:name="_Hlk209431313"/>
+      <w:bookmarkStart w:id="29" w:name="_Hlk209431313"/>
       <w:r>
         <w:rPr>
           <w:noProof/>
@@ -5669,7 +6057,7 @@
         </w:rPr>
         <w:t>ortadas.</w:t>
       </w:r>
-      <w:bookmarkEnd w:id="23"/>
+      <w:bookmarkEnd w:id="29"/>
     </w:p>
     <w:p>
       <w:pPr>
@@ -6166,7 +6554,7 @@
         </w:rPr>
         <w:t xml:space="preserve"> En esta hoja de reporte se identifican todas las modificaciones detectadas en los valores entre </w:t>
       </w:r>
-      <w:del w:id="24" w:author="Karina Stapfer Jara" w:date="2025-11-11T14:44:00Z" w16du:dateUtc="2025-11-11T17:44:00Z">
+      <w:del w:id="30" w:author="Karina Stapfer Jara" w:date="2025-11-11T14:44:00Z" w16du:dateUtc="2025-11-11T17:44:00Z">
         <w:r>
           <w:rPr>
             <w:rFonts w:ascii="Segoe UI Light" w:hAnsi="Segoe UI Light" w:cs="Segoe UI Light"/>
@@ -6176,7 +6564,7 @@
           <w:delText>los archivos emparejados</w:delText>
         </w:r>
       </w:del>
-      <w:ins w:id="25" w:author="Karina Stapfer Jara" w:date="2025-11-11T14:44:00Z" w16du:dateUtc="2025-11-11T17:44:00Z">
+      <w:ins w:id="31" w:author="Karina Stapfer Jara" w:date="2025-11-11T14:44:00Z" w16du:dateUtc="2025-11-11T17:44:00Z">
         <w:r>
           <w:rPr>
             <w:rFonts w:ascii="Segoe UI Light" w:hAnsi="Segoe UI Light" w:cs="Segoe UI Light"/>
@@ -6186,7 +6574,7 @@
           <w:t>dos archivos,</w:t>
         </w:r>
       </w:ins>
-      <w:ins w:id="26" w:author="Karina Stapfer Jara" w:date="2025-11-11T14:45:00Z" w16du:dateUtc="2025-11-11T17:45:00Z">
+      <w:ins w:id="32" w:author="Karina Stapfer Jara" w:date="2025-11-11T14:45:00Z" w16du:dateUtc="2025-11-11T17:45:00Z">
         <w:r>
           <w:rPr>
             <w:rFonts w:ascii="Segoe UI Light" w:hAnsi="Segoe UI Light" w:cs="Segoe UI Light"/>
@@ -6196,7 +6584,7 @@
           <w:t xml:space="preserve"> es decir al comparar dos archivos de un </w:t>
         </w:r>
       </w:ins>
-      <w:ins w:id="27" w:author="Karina Stapfer Jara" w:date="2025-11-11T14:44:00Z" w16du:dateUtc="2025-11-11T17:44:00Z">
+      <w:ins w:id="33" w:author="Karina Stapfer Jara" w:date="2025-11-11T14:44:00Z" w16du:dateUtc="2025-11-11T17:44:00Z">
         <w:r>
           <w:rPr>
             <w:rFonts w:ascii="Segoe UI Light" w:hAnsi="Segoe UI Light" w:cs="Segoe UI Light"/>
@@ -6396,7 +6784,7 @@
           <w:bCs w:val="0"/>
         </w:rPr>
       </w:pPr>
-      <w:bookmarkStart w:id="28" w:name="_Toc234404047"/>
+      <w:bookmarkStart w:id="34" w:name="_Toc234422432"/>
       <w:r>
         <w:rPr>
           <w:b w:val="0"/>
@@ -6405,7 +6793,7 @@
         <w:lastRenderedPageBreak/>
         <w:t>ESTRUCTURA REPORTE ERRORES-CONSISTENCIAS-REM.XLSX:</w:t>
       </w:r>
-      <w:bookmarkEnd w:id="28"/>
+      <w:bookmarkEnd w:id="34"/>
     </w:p>
     <w:p>
       <w:pPr>
@@ -7145,7 +7533,7 @@
       <w:pPr>
         <w:spacing w:line="21" w:lineRule="atLeast"/>
         <w:rPr>
-          <w:ins w:id="29" w:author="Karina Stapfer Jara" w:date="2025-11-11T14:46:00Z" w16du:dateUtc="2025-11-11T17:46:00Z"/>
+          <w:ins w:id="35" w:author="Karina Stapfer Jara" w:date="2025-11-11T14:46:00Z" w16du:dateUtc="2025-11-11T17:46:00Z"/>
           <w:b/>
           <w:bCs/>
           <w:sz w:val="20"/>
@@ -7157,10 +7545,10 @@
       <w:pPr>
         <w:pStyle w:val="Titulo"/>
       </w:pPr>
-      <w:bookmarkStart w:id="30" w:name="_Toc213764895"/>
-      <w:bookmarkStart w:id="31" w:name="_Toc234403686"/>
-      <w:bookmarkStart w:id="32" w:name="_Toc234404048"/>
-      <w:ins w:id="33" w:author="Karina Stapfer Jara" w:date="2025-11-11T14:46:00Z" w16du:dateUtc="2025-11-11T17:46:00Z">
+      <w:bookmarkStart w:id="36" w:name="_Toc213764895"/>
+      <w:bookmarkStart w:id="37" w:name="_Toc234403686"/>
+      <w:bookmarkStart w:id="38" w:name="_Toc234422433"/>
+      <w:ins w:id="39" w:author="Karina Stapfer Jara" w:date="2025-11-11T14:46:00Z" w16du:dateUtc="2025-11-11T17:46:00Z">
         <w:r>
           <w:t>EJECUCIÓN DEL APLICATIVO DE VALIDA</w:t>
         </w:r>
@@ -7168,14 +7556,14 @@
       <w:r>
         <w:t>DOR CONSISTENCIAS</w:t>
       </w:r>
-      <w:ins w:id="34" w:author="Karina Stapfer Jara" w:date="2025-11-11T14:46:00Z" w16du:dateUtc="2025-11-11T17:46:00Z">
+      <w:ins w:id="40" w:author="Karina Stapfer Jara" w:date="2025-11-11T14:46:00Z" w16du:dateUtc="2025-11-11T17:46:00Z">
         <w:r>
           <w:t xml:space="preserve"> REM: Directorios y archivos de salida de configuración.</w:t>
         </w:r>
       </w:ins>
-      <w:bookmarkEnd w:id="30"/>
-      <w:bookmarkEnd w:id="31"/>
-      <w:bookmarkEnd w:id="32"/>
+      <w:bookmarkEnd w:id="36"/>
+      <w:bookmarkEnd w:id="37"/>
+      <w:bookmarkEnd w:id="38"/>
       <w:r>
         <w:t xml:space="preserve"> </w:t>
       </w:r>
@@ -7392,7 +7780,7 @@
         </w:rPr>
         <w:t>, si es que no existe previamente. En este directorio se depositan, por cada ejecución</w:t>
       </w:r>
-      <w:ins w:id="35" w:author="Karina Stapfer Jara" w:date="2025-11-11T14:47:00Z" w16du:dateUtc="2025-11-11T17:47:00Z">
+      <w:ins w:id="41" w:author="Karina Stapfer Jara" w:date="2025-11-11T14:47:00Z" w16du:dateUtc="2025-11-11T17:47:00Z">
         <w:r>
           <w:rPr>
             <w:rFonts w:ascii="Segoe UI Light" w:hAnsi="Segoe UI Light" w:cs="Segoe UI Light"/>
@@ -9224,6 +9612,95 @@
     </w:lvl>
   </w:abstractNum>
   <w:abstractNum w:abstractNumId="8" w15:restartNumberingAfterBreak="0">
+    <w:nsid w:val="327F02A0"/>
+    <w:multiLevelType w:val="hybridMultilevel"/>
+    <w:tmpl w:val="4AA28C04"/>
+    <w:lvl w:ilvl="0" w:tplc="340A000F">
+      <w:start w:val="1"/>
+      <w:numFmt w:val="decimal"/>
+      <w:lvlText w:val="%1."/>
+      <w:lvlJc w:val="left"/>
+      <w:pPr>
+        <w:ind w:left="720" w:hanging="360"/>
+      </w:pPr>
+      <w:rPr>
+        <w:rFonts w:hint="default"/>
+      </w:rPr>
+    </w:lvl>
+    <w:lvl w:ilvl="1" w:tplc="340A0019" w:tentative="1">
+      <w:start w:val="1"/>
+      <w:numFmt w:val="lowerLetter"/>
+      <w:lvlText w:val="%2."/>
+      <w:lvlJc w:val="left"/>
+      <w:pPr>
+        <w:ind w:left="1440" w:hanging="360"/>
+      </w:pPr>
+    </w:lvl>
+    <w:lvl w:ilvl="2" w:tplc="340A001B" w:tentative="1">
+      <w:start w:val="1"/>
+      <w:numFmt w:val="lowerRoman"/>
+      <w:lvlText w:val="%3."/>
+      <w:lvlJc w:val="right"/>
+      <w:pPr>
+        <w:ind w:left="2160" w:hanging="180"/>
+      </w:pPr>
+    </w:lvl>
+    <w:lvl w:ilvl="3" w:tplc="340A000F" w:tentative="1">
+      <w:start w:val="1"/>
+      <w:numFmt w:val="decimal"/>
+      <w:lvlText w:val="%4."/>
+      <w:lvlJc w:val="left"/>
+      <w:pPr>
+        <w:ind w:left="2880" w:hanging="360"/>
+      </w:pPr>
+    </w:lvl>
+    <w:lvl w:ilvl="4" w:tplc="340A0019" w:tentative="1">
+      <w:start w:val="1"/>
+      <w:numFmt w:val="lowerLetter"/>
+      <w:lvlText w:val="%5."/>
+      <w:lvlJc w:val="left"/>
+      <w:pPr>
+        <w:ind w:left="3600" w:hanging="360"/>
+      </w:pPr>
+    </w:lvl>
+    <w:lvl w:ilvl="5" w:tplc="340A001B" w:tentative="1">
+      <w:start w:val="1"/>
+      <w:numFmt w:val="lowerRoman"/>
+      <w:lvlText w:val="%6."/>
+      <w:lvlJc w:val="right"/>
+      <w:pPr>
+        <w:ind w:left="4320" w:hanging="180"/>
+      </w:pPr>
+    </w:lvl>
+    <w:lvl w:ilvl="6" w:tplc="340A000F" w:tentative="1">
+      <w:start w:val="1"/>
+      <w:numFmt w:val="decimal"/>
+      <w:lvlText w:val="%7."/>
+      <w:lvlJc w:val="left"/>
+      <w:pPr>
+        <w:ind w:left="5040" w:hanging="360"/>
+      </w:pPr>
+    </w:lvl>
+    <w:lvl w:ilvl="7" w:tplc="340A0019" w:tentative="1">
+      <w:start w:val="1"/>
+      <w:numFmt w:val="lowerLetter"/>
+      <w:lvlText w:val="%8."/>
+      <w:lvlJc w:val="left"/>
+      <w:pPr>
+        <w:ind w:left="5760" w:hanging="360"/>
+      </w:pPr>
+    </w:lvl>
+    <w:lvl w:ilvl="8" w:tplc="340A001B" w:tentative="1">
+      <w:start w:val="1"/>
+      <w:numFmt w:val="lowerRoman"/>
+      <w:lvlText w:val="%9."/>
+      <w:lvlJc w:val="right"/>
+      <w:pPr>
+        <w:ind w:left="6480" w:hanging="180"/>
+      </w:pPr>
+    </w:lvl>
+  </w:abstractNum>
+  <w:abstractNum w:abstractNumId="9" w15:restartNumberingAfterBreak="0">
     <w:nsid w:val="36132515"/>
     <w:multiLevelType w:val="hybridMultilevel"/>
     <w:tmpl w:val="87B83052"/>
@@ -9309,7 +9786,7 @@
       </w:pPr>
     </w:lvl>
   </w:abstractNum>
-  <w:abstractNum w:abstractNumId="9" w15:restartNumberingAfterBreak="0">
+  <w:abstractNum w:abstractNumId="10" w15:restartNumberingAfterBreak="0">
     <w:nsid w:val="388D49CA"/>
     <w:multiLevelType w:val="hybridMultilevel"/>
     <w:tmpl w:val="5748F8EC"/>
@@ -9401,7 +9878,7 @@
       </w:pPr>
     </w:lvl>
   </w:abstractNum>
-  <w:abstractNum w:abstractNumId="10" w15:restartNumberingAfterBreak="0">
+  <w:abstractNum w:abstractNumId="11" w15:restartNumberingAfterBreak="0">
     <w:nsid w:val="39C60ED5"/>
     <w:multiLevelType w:val="hybridMultilevel"/>
     <w:tmpl w:val="46C6A066"/>
@@ -9514,7 +9991,7 @@
       </w:rPr>
     </w:lvl>
   </w:abstractNum>
-  <w:abstractNum w:abstractNumId="11" w15:restartNumberingAfterBreak="0">
+  <w:abstractNum w:abstractNumId="12" w15:restartNumberingAfterBreak="0">
     <w:nsid w:val="3C762814"/>
     <w:multiLevelType w:val="hybridMultilevel"/>
     <w:tmpl w:val="7D2A3262"/>
@@ -9600,7 +10077,7 @@
       </w:pPr>
     </w:lvl>
   </w:abstractNum>
-  <w:abstractNum w:abstractNumId="12" w15:restartNumberingAfterBreak="0">
+  <w:abstractNum w:abstractNumId="13" w15:restartNumberingAfterBreak="0">
     <w:nsid w:val="4D086102"/>
     <w:multiLevelType w:val="multilevel"/>
     <w:tmpl w:val="91F85F5C"/>
@@ -9749,7 +10226,7 @@
       </w:rPr>
     </w:lvl>
   </w:abstractNum>
-  <w:abstractNum w:abstractNumId="13" w15:restartNumberingAfterBreak="0">
+  <w:abstractNum w:abstractNumId="14" w15:restartNumberingAfterBreak="0">
     <w:nsid w:val="51950F8E"/>
     <w:multiLevelType w:val="hybridMultilevel"/>
     <w:tmpl w:val="AA8C680A"/>
@@ -9862,7 +10339,7 @@
       </w:rPr>
     </w:lvl>
   </w:abstractNum>
-  <w:abstractNum w:abstractNumId="14" w15:restartNumberingAfterBreak="0">
+  <w:abstractNum w:abstractNumId="15" w15:restartNumberingAfterBreak="0">
     <w:nsid w:val="59857E83"/>
     <w:multiLevelType w:val="hybridMultilevel"/>
     <w:tmpl w:val="D534B286"/>
@@ -9951,7 +10428,7 @@
       </w:pPr>
     </w:lvl>
   </w:abstractNum>
-  <w:abstractNum w:abstractNumId="15" w15:restartNumberingAfterBreak="0">
+  <w:abstractNum w:abstractNumId="16" w15:restartNumberingAfterBreak="0">
     <w:nsid w:val="6F567614"/>
     <w:multiLevelType w:val="hybridMultilevel"/>
     <w:tmpl w:val="12E6668C"/>
@@ -10064,7 +10541,7 @@
       </w:rPr>
     </w:lvl>
   </w:abstractNum>
-  <w:abstractNum w:abstractNumId="16" w15:restartNumberingAfterBreak="0">
+  <w:abstractNum w:abstractNumId="17" w15:restartNumberingAfterBreak="0">
     <w:nsid w:val="73D90A6A"/>
     <w:multiLevelType w:val="hybridMultilevel"/>
     <w:tmpl w:val="2E12F838"/>
@@ -10177,7 +10654,7 @@
       </w:rPr>
     </w:lvl>
   </w:abstractNum>
-  <w:abstractNum w:abstractNumId="17" w15:restartNumberingAfterBreak="0">
+  <w:abstractNum w:abstractNumId="18" w15:restartNumberingAfterBreak="0">
     <w:nsid w:val="7A4B56FA"/>
     <w:multiLevelType w:val="hybridMultilevel"/>
     <w:tmpl w:val="1AE4EFE0"/>
@@ -10266,7 +10743,7 @@
       </w:pPr>
     </w:lvl>
   </w:abstractNum>
-  <w:abstractNum w:abstractNumId="18" w15:restartNumberingAfterBreak="0">
+  <w:abstractNum w:abstractNumId="19" w15:restartNumberingAfterBreak="0">
     <w:nsid w:val="7DC829CF"/>
     <w:multiLevelType w:val="hybridMultilevel"/>
     <w:tmpl w:val="C228EF84"/>
@@ -10385,34 +10862,34 @@
     <w:abstractNumId w:val="7"/>
   </w:num>
   <w:num w:numId="3" w16cid:durableId="1904873504">
-    <w:abstractNumId w:val="13"/>
+    <w:abstractNumId w:val="14"/>
   </w:num>
   <w:num w:numId="4" w16cid:durableId="1047223193">
-    <w:abstractNumId w:val="11"/>
+    <w:abstractNumId w:val="12"/>
   </w:num>
   <w:num w:numId="5" w16cid:durableId="1181316407">
     <w:abstractNumId w:val="1"/>
   </w:num>
   <w:num w:numId="6" w16cid:durableId="1502507256">
-    <w:abstractNumId w:val="8"/>
+    <w:abstractNumId w:val="9"/>
   </w:num>
   <w:num w:numId="7" w16cid:durableId="1921670682">
-    <w:abstractNumId w:val="17"/>
+    <w:abstractNumId w:val="18"/>
   </w:num>
   <w:num w:numId="8" w16cid:durableId="549194167">
     <w:abstractNumId w:val="0"/>
   </w:num>
   <w:num w:numId="9" w16cid:durableId="587619294">
+    <w:abstractNumId w:val="17"/>
+  </w:num>
+  <w:num w:numId="10" w16cid:durableId="900293374">
     <w:abstractNumId w:val="16"/>
   </w:num>
-  <w:num w:numId="10" w16cid:durableId="900293374">
-    <w:abstractNumId w:val="15"/>
-  </w:num>
   <w:num w:numId="11" w16cid:durableId="2123070432">
-    <w:abstractNumId w:val="10"/>
+    <w:abstractNumId w:val="11"/>
   </w:num>
   <w:num w:numId="12" w16cid:durableId="1897621082">
-    <w:abstractNumId w:val="14"/>
+    <w:abstractNumId w:val="15"/>
   </w:num>
   <w:num w:numId="13" w16cid:durableId="1828202708">
     <w:abstractNumId w:val="2"/>
@@ -10421,19 +10898,22 @@
     <w:abstractNumId w:val="5"/>
   </w:num>
   <w:num w:numId="15" w16cid:durableId="1611206136">
-    <w:abstractNumId w:val="9"/>
+    <w:abstractNumId w:val="10"/>
   </w:num>
   <w:num w:numId="16" w16cid:durableId="230653257">
     <w:abstractNumId w:val="6"/>
   </w:num>
   <w:num w:numId="17" w16cid:durableId="1666934385">
-    <w:abstractNumId w:val="12"/>
+    <w:abstractNumId w:val="13"/>
   </w:num>
   <w:num w:numId="18" w16cid:durableId="2048337778">
-    <w:abstractNumId w:val="18"/>
+    <w:abstractNumId w:val="19"/>
   </w:num>
   <w:num w:numId="19" w16cid:durableId="125465586">
     <w:abstractNumId w:val="3"/>
+  </w:num>
+  <w:num w:numId="20" w16cid:durableId="691032690">
+    <w:abstractNumId w:val="8"/>
   </w:num>
   <w:numIdMacAtCleanup w:val="3"/>
 </w:numbering>
@@ -12010,8 +12490,10 @@
     <w:rsid w:val="00472E08"/>
     <w:rsid w:val="00493544"/>
     <w:rsid w:val="004B7878"/>
+    <w:rsid w:val="004C58F9"/>
     <w:rsid w:val="004C6224"/>
     <w:rsid w:val="005204C8"/>
+    <w:rsid w:val="00526BE4"/>
     <w:rsid w:val="00527932"/>
     <w:rsid w:val="00535C9E"/>
     <w:rsid w:val="005511E2"/>

</xml_diff>